<commit_message>
update laporan pake parsifal
</commit_message>
<xml_diff>
--- a/Laporan Proyek 3 Sam.docx
+++ b/Laporan Proyek 3 Sam.docx
@@ -287,7 +287,7 @@
           <w:lang w:val="id-ID" w:eastAsia="id-ID"/>
         </w:rPr>
         <w:drawing>
-          <wp:anchor distT="0" distB="0" distL="114300" distR="114300" simplePos="0" relativeHeight="251659264" behindDoc="0" locked="0" layoutInCell="1" allowOverlap="1" wp14:anchorId="7E069EBA" wp14:editId="38AB399C">
+          <wp:anchor distT="0" distB="0" distL="114300" distR="114300" simplePos="0" relativeHeight="251659264" behindDoc="0" locked="0" layoutInCell="1" allowOverlap="1" wp14:anchorId="7E069EBA" wp14:editId="2F2E017F">
             <wp:simplePos x="0" y="0"/>
             <wp:positionH relativeFrom="margin">
               <wp:posOffset>473075</wp:posOffset>
@@ -930,7 +930,7 @@
           <w:szCs w:val="28"/>
         </w:rPr>
       </w:pPr>
-      <w:bookmarkStart w:id="3" w:name="_Toc219036859"/>
+      <w:bookmarkStart w:id="3" w:name="_Toc220012241"/>
       <w:r>
         <w:rPr>
           <w:rFonts w:ascii="Times New Roman" w:hAnsi="Times New Roman" w:cs="Times New Roman"/>
@@ -1371,18 +1371,8 @@
                                 <w:sz w:val="24"/>
                                 <w:szCs w:val="24"/>
                               </w:rPr>
-                              <w:t xml:space="preserve">Dosen </w:t>
+                              <w:t>Dosen Pembimbing</w:t>
                             </w:r>
-                            <w:proofErr w:type="spellStart"/>
-                            <w:r>
-                              <w:rPr>
-                                <w:rFonts w:ascii="Times New Roman" w:hAnsi="Times New Roman" w:cs="Times New Roman"/>
-                                <w:sz w:val="24"/>
-                                <w:szCs w:val="24"/>
-                              </w:rPr>
-                              <w:t>Pembimbing</w:t>
-                            </w:r>
-                            <w:proofErr w:type="spellEnd"/>
                           </w:p>
                           <w:p>
                             <w:pPr>
@@ -1433,53 +1423,7 @@
                                 <w:u w:val="single"/>
                                 <w:shd w:val="clear" w:color="auto" w:fill="FFFFFF"/>
                               </w:rPr>
-                              <w:t xml:space="preserve">Rolly Maulana </w:t>
-                            </w:r>
-                            <w:proofErr w:type="spellStart"/>
-                            <w:proofErr w:type="gramStart"/>
-                            <w:r>
-                              <w:rPr>
-                                <w:rFonts w:asciiTheme="majorBidi" w:hAnsiTheme="majorBidi" w:cstheme="majorBidi"/>
-                                <w:sz w:val="24"/>
-                                <w:szCs w:val="24"/>
-                                <w:u w:val="single"/>
-                                <w:shd w:val="clear" w:color="auto" w:fill="FFFFFF"/>
-                              </w:rPr>
-                              <w:t>Awangga,S.T.</w:t>
-                            </w:r>
-                            <w:proofErr w:type="gramEnd"/>
-                            <w:r>
-                              <w:rPr>
-                                <w:rFonts w:asciiTheme="majorBidi" w:hAnsiTheme="majorBidi" w:cstheme="majorBidi"/>
-                                <w:sz w:val="24"/>
-                                <w:szCs w:val="24"/>
-                                <w:u w:val="single"/>
-                                <w:shd w:val="clear" w:color="auto" w:fill="FFFFFF"/>
-                              </w:rPr>
-                              <w:t>,</w:t>
-                            </w:r>
-                            <w:proofErr w:type="gramStart"/>
-                            <w:r>
-                              <w:rPr>
-                                <w:rFonts w:asciiTheme="majorBidi" w:hAnsiTheme="majorBidi" w:cstheme="majorBidi"/>
-                                <w:sz w:val="24"/>
-                                <w:szCs w:val="24"/>
-                                <w:u w:val="single"/>
-                                <w:shd w:val="clear" w:color="auto" w:fill="FFFFFF"/>
-                              </w:rPr>
-                              <w:t>MT.,CAIP</w:t>
-                            </w:r>
-                            <w:proofErr w:type="spellEnd"/>
-                            <w:proofErr w:type="gramEnd"/>
-                            <w:r>
-                              <w:rPr>
-                                <w:rFonts w:asciiTheme="majorBidi" w:hAnsiTheme="majorBidi" w:cstheme="majorBidi"/>
-                                <w:sz w:val="24"/>
-                                <w:szCs w:val="24"/>
-                                <w:u w:val="single"/>
-                                <w:shd w:val="clear" w:color="auto" w:fill="FFFFFF"/>
-                              </w:rPr>
-                              <w:t>, SFPC.</w:t>
+                              <w:t>Rolly Maulana Awangga,S.T.,MT.,CAIP, SFPC.</w:t>
                             </w:r>
                           </w:p>
                           <w:p>
@@ -1627,18 +1571,8 @@
                           <w:sz w:val="24"/>
                           <w:szCs w:val="24"/>
                         </w:rPr>
-                        <w:t xml:space="preserve">Dosen </w:t>
+                        <w:t>Dosen Pembimbing</w:t>
                       </w:r>
-                      <w:proofErr w:type="spellStart"/>
-                      <w:r>
-                        <w:rPr>
-                          <w:rFonts w:ascii="Times New Roman" w:hAnsi="Times New Roman" w:cs="Times New Roman"/>
-                          <w:sz w:val="24"/>
-                          <w:szCs w:val="24"/>
-                        </w:rPr>
-                        <w:t>Pembimbing</w:t>
-                      </w:r>
-                      <w:proofErr w:type="spellEnd"/>
                     </w:p>
                     <w:p>
                       <w:pPr>
@@ -1689,53 +1623,7 @@
                           <w:u w:val="single"/>
                           <w:shd w:val="clear" w:color="auto" w:fill="FFFFFF"/>
                         </w:rPr>
-                        <w:t xml:space="preserve">Rolly Maulana </w:t>
-                      </w:r>
-                      <w:proofErr w:type="spellStart"/>
-                      <w:proofErr w:type="gramStart"/>
-                      <w:r>
-                        <w:rPr>
-                          <w:rFonts w:asciiTheme="majorBidi" w:hAnsiTheme="majorBidi" w:cstheme="majorBidi"/>
-                          <w:sz w:val="24"/>
-                          <w:szCs w:val="24"/>
-                          <w:u w:val="single"/>
-                          <w:shd w:val="clear" w:color="auto" w:fill="FFFFFF"/>
-                        </w:rPr>
-                        <w:t>Awangga,S.T.</w:t>
-                      </w:r>
-                      <w:proofErr w:type="gramEnd"/>
-                      <w:r>
-                        <w:rPr>
-                          <w:rFonts w:asciiTheme="majorBidi" w:hAnsiTheme="majorBidi" w:cstheme="majorBidi"/>
-                          <w:sz w:val="24"/>
-                          <w:szCs w:val="24"/>
-                          <w:u w:val="single"/>
-                          <w:shd w:val="clear" w:color="auto" w:fill="FFFFFF"/>
-                        </w:rPr>
-                        <w:t>,</w:t>
-                      </w:r>
-                      <w:proofErr w:type="gramStart"/>
-                      <w:r>
-                        <w:rPr>
-                          <w:rFonts w:asciiTheme="majorBidi" w:hAnsiTheme="majorBidi" w:cstheme="majorBidi"/>
-                          <w:sz w:val="24"/>
-                          <w:szCs w:val="24"/>
-                          <w:u w:val="single"/>
-                          <w:shd w:val="clear" w:color="auto" w:fill="FFFFFF"/>
-                        </w:rPr>
-                        <w:t>MT.,CAIP</w:t>
-                      </w:r>
-                      <w:proofErr w:type="spellEnd"/>
-                      <w:proofErr w:type="gramEnd"/>
-                      <w:r>
-                        <w:rPr>
-                          <w:rFonts w:asciiTheme="majorBidi" w:hAnsiTheme="majorBidi" w:cstheme="majorBidi"/>
-                          <w:sz w:val="24"/>
-                          <w:szCs w:val="24"/>
-                          <w:u w:val="single"/>
-                          <w:shd w:val="clear" w:color="auto" w:fill="FFFFFF"/>
-                        </w:rPr>
-                        <w:t>, SFPC.</w:t>
+                        <w:t>Rolly Maulana Awangga,S.T.,MT.,CAIP, SFPC.</w:t>
                       </w:r>
                     </w:p>
                     <w:p>
@@ -1908,41 +1796,13 @@
                                 <w:szCs w:val="24"/>
                               </w:rPr>
                             </w:pPr>
-                            <w:proofErr w:type="spellStart"/>
                             <w:r>
                               <w:rPr>
                                 <w:rFonts w:ascii="Times New Roman" w:hAnsi="Times New Roman" w:cs="Times New Roman"/>
                                 <w:sz w:val="24"/>
                                 <w:szCs w:val="24"/>
                               </w:rPr>
-                              <w:t>Koordinator</w:t>
-                            </w:r>
-                            <w:proofErr w:type="spellEnd"/>
-                            <w:r>
-                              <w:rPr>
-                                <w:rFonts w:ascii="Times New Roman" w:hAnsi="Times New Roman" w:cs="Times New Roman"/>
-                                <w:sz w:val="24"/>
-                                <w:szCs w:val="24"/>
-                              </w:rPr>
-                              <w:t xml:space="preserve"> </w:t>
-                            </w:r>
-                            <w:proofErr w:type="spellStart"/>
-                            <w:r>
-                              <w:rPr>
-                                <w:rFonts w:ascii="Times New Roman" w:hAnsi="Times New Roman" w:cs="Times New Roman"/>
-                                <w:sz w:val="24"/>
-                                <w:szCs w:val="24"/>
-                              </w:rPr>
-                              <w:t>Proyek</w:t>
-                            </w:r>
-                            <w:proofErr w:type="spellEnd"/>
-                            <w:r>
-                              <w:rPr>
-                                <w:rFonts w:ascii="Times New Roman" w:hAnsi="Times New Roman" w:cs="Times New Roman"/>
-                                <w:sz w:val="24"/>
-                                <w:szCs w:val="24"/>
-                              </w:rPr>
-                              <w:t xml:space="preserve"> 3</w:t>
+                              <w:t>Koordinator Proyek 3</w:t>
                             </w:r>
                           </w:p>
                           <w:p>
@@ -2015,31 +1875,7 @@
                                 <w:szCs w:val="24"/>
                                 <w:shd w:val="clear" w:color="auto" w:fill="FFFFFF"/>
                               </w:rPr>
-                              <w:t xml:space="preserve">, </w:t>
-                            </w:r>
-                            <w:proofErr w:type="spellStart"/>
-                            <w:r>
-                              <w:rPr>
-                                <w:rStyle w:val="Hyperlink"/>
-                                <w:rFonts w:asciiTheme="majorBidi" w:hAnsiTheme="majorBidi"/>
-                                <w:color w:val="auto"/>
-                                <w:sz w:val="24"/>
-                                <w:szCs w:val="24"/>
-                                <w:shd w:val="clear" w:color="auto" w:fill="FFFFFF"/>
-                              </w:rPr>
-                              <w:t>S.Kom</w:t>
-                            </w:r>
-                            <w:proofErr w:type="spellEnd"/>
-                            <w:r>
-                              <w:rPr>
-                                <w:rStyle w:val="Hyperlink"/>
-                                <w:rFonts w:asciiTheme="majorBidi" w:hAnsiTheme="majorBidi"/>
-                                <w:color w:val="auto"/>
-                                <w:sz w:val="24"/>
-                                <w:szCs w:val="24"/>
-                                <w:shd w:val="clear" w:color="auto" w:fill="FFFFFF"/>
-                              </w:rPr>
-                              <w:t>., M.T.</w:t>
+                              <w:t>, S.Kom., M.T.</w:t>
                             </w:r>
                           </w:p>
                           <w:p>
@@ -2146,41 +1982,13 @@
                           <w:szCs w:val="24"/>
                         </w:rPr>
                       </w:pPr>
-                      <w:proofErr w:type="spellStart"/>
                       <w:r>
                         <w:rPr>
                           <w:rFonts w:ascii="Times New Roman" w:hAnsi="Times New Roman" w:cs="Times New Roman"/>
                           <w:sz w:val="24"/>
                           <w:szCs w:val="24"/>
                         </w:rPr>
-                        <w:t>Koordinator</w:t>
-                      </w:r>
-                      <w:proofErr w:type="spellEnd"/>
-                      <w:r>
-                        <w:rPr>
-                          <w:rFonts w:ascii="Times New Roman" w:hAnsi="Times New Roman" w:cs="Times New Roman"/>
-                          <w:sz w:val="24"/>
-                          <w:szCs w:val="24"/>
-                        </w:rPr>
-                        <w:t xml:space="preserve"> </w:t>
-                      </w:r>
-                      <w:proofErr w:type="spellStart"/>
-                      <w:r>
-                        <w:rPr>
-                          <w:rFonts w:ascii="Times New Roman" w:hAnsi="Times New Roman" w:cs="Times New Roman"/>
-                          <w:sz w:val="24"/>
-                          <w:szCs w:val="24"/>
-                        </w:rPr>
-                        <w:t>Proyek</w:t>
-                      </w:r>
-                      <w:proofErr w:type="spellEnd"/>
-                      <w:r>
-                        <w:rPr>
-                          <w:rFonts w:ascii="Times New Roman" w:hAnsi="Times New Roman" w:cs="Times New Roman"/>
-                          <w:sz w:val="24"/>
-                          <w:szCs w:val="24"/>
-                        </w:rPr>
-                        <w:t xml:space="preserve"> 3</w:t>
+                        <w:t>Koordinator Proyek 3</w:t>
                       </w:r>
                     </w:p>
                     <w:p>
@@ -2253,31 +2061,7 @@
                           <w:szCs w:val="24"/>
                           <w:shd w:val="clear" w:color="auto" w:fill="FFFFFF"/>
                         </w:rPr>
-                        <w:t xml:space="preserve">, </w:t>
-                      </w:r>
-                      <w:proofErr w:type="spellStart"/>
-                      <w:r>
-                        <w:rPr>
-                          <w:rStyle w:val="Hyperlink"/>
-                          <w:rFonts w:asciiTheme="majorBidi" w:hAnsiTheme="majorBidi"/>
-                          <w:color w:val="auto"/>
-                          <w:sz w:val="24"/>
-                          <w:szCs w:val="24"/>
-                          <w:shd w:val="clear" w:color="auto" w:fill="FFFFFF"/>
-                        </w:rPr>
-                        <w:t>S.Kom</w:t>
-                      </w:r>
-                      <w:proofErr w:type="spellEnd"/>
-                      <w:r>
-                        <w:rPr>
-                          <w:rStyle w:val="Hyperlink"/>
-                          <w:rFonts w:asciiTheme="majorBidi" w:hAnsiTheme="majorBidi"/>
-                          <w:color w:val="auto"/>
-                          <w:sz w:val="24"/>
-                          <w:szCs w:val="24"/>
-                          <w:shd w:val="clear" w:color="auto" w:fill="FFFFFF"/>
-                        </w:rPr>
-                        <w:t>., M.T.</w:t>
+                        <w:t>, S.Kom., M.T.</w:t>
                       </w:r>
                     </w:p>
                     <w:p>
@@ -2441,7 +2225,6 @@
                                 <w:szCs w:val="24"/>
                               </w:rPr>
                             </w:pPr>
-                            <w:proofErr w:type="spellStart"/>
                             <w:r>
                               <w:rPr>
                                 <w:rFonts w:ascii="Times New Roman" w:hAnsi="Times New Roman" w:cs="Times New Roman"/>
@@ -2450,7 +2233,6 @@
                               </w:rPr>
                               <w:t>Menyetujui</w:t>
                             </w:r>
-                            <w:proofErr w:type="spellEnd"/>
                           </w:p>
                           <w:p>
                             <w:pPr>
@@ -2461,34 +2243,14 @@
                                 <w:szCs w:val="24"/>
                               </w:rPr>
                             </w:pPr>
-                            <w:proofErr w:type="spellStart"/>
                             <w:r>
                               <w:rPr>
                                 <w:rFonts w:ascii="Times New Roman" w:hAnsi="Times New Roman" w:cs="Times New Roman"/>
                                 <w:sz w:val="24"/>
                                 <w:szCs w:val="24"/>
                               </w:rPr>
-                              <w:t>Ketua</w:t>
+                              <w:t>Ketua Program Studi DIV Teknik Informatika</w:t>
                             </w:r>
-                            <w:proofErr w:type="spellEnd"/>
-                            <w:r>
-                              <w:rPr>
-                                <w:rFonts w:ascii="Times New Roman" w:hAnsi="Times New Roman" w:cs="Times New Roman"/>
-                                <w:sz w:val="24"/>
-                                <w:szCs w:val="24"/>
-                              </w:rPr>
-                              <w:t xml:space="preserve"> Program Studi DIV Teknik </w:t>
-                            </w:r>
-                            <w:proofErr w:type="spellStart"/>
-                            <w:r>
-                              <w:rPr>
-                                <w:rFonts w:ascii="Times New Roman" w:hAnsi="Times New Roman" w:cs="Times New Roman"/>
-                                <w:sz w:val="24"/>
-                                <w:szCs w:val="24"/>
-                              </w:rPr>
-                              <w:t>Informatika</w:t>
-                            </w:r>
-                            <w:proofErr w:type="spellEnd"/>
                           </w:p>
                           <w:p>
                             <w:pPr>
@@ -2538,29 +2300,7 @@
                                   <w:sz w:val="24"/>
                                   <w:szCs w:val="24"/>
                                 </w:rPr>
-                                <w:t xml:space="preserve">Roni Andarsyah, S.T., </w:t>
-                              </w:r>
-                              <w:proofErr w:type="spellStart"/>
-                              <w:r>
-                                <w:rPr>
-                                  <w:rStyle w:val="Hyperlink"/>
-                                  <w:rFonts w:asciiTheme="majorBidi" w:hAnsiTheme="majorBidi"/>
-                                  <w:color w:val="auto"/>
-                                  <w:sz w:val="24"/>
-                                  <w:szCs w:val="24"/>
-                                </w:rPr>
-                                <w:t>M.Kom</w:t>
-                              </w:r>
-                              <w:proofErr w:type="spellEnd"/>
-                              <w:r>
-                                <w:rPr>
-                                  <w:rStyle w:val="Hyperlink"/>
-                                  <w:rFonts w:asciiTheme="majorBidi" w:hAnsiTheme="majorBidi"/>
-                                  <w:color w:val="auto"/>
-                                  <w:sz w:val="24"/>
-                                  <w:szCs w:val="24"/>
-                                </w:rPr>
-                                <w:t>., SFPC</w:t>
+                                <w:t>Roni Andarsyah, S.T., M.Kom., SFPC</w:t>
                               </w:r>
                             </w:hyperlink>
                           </w:p>
@@ -2669,7 +2409,6 @@
                           <w:szCs w:val="24"/>
                         </w:rPr>
                       </w:pPr>
-                      <w:proofErr w:type="spellStart"/>
                       <w:r>
                         <w:rPr>
                           <w:rFonts w:ascii="Times New Roman" w:hAnsi="Times New Roman" w:cs="Times New Roman"/>
@@ -2678,7 +2417,6 @@
                         </w:rPr>
                         <w:t>Menyetujui</w:t>
                       </w:r>
-                      <w:proofErr w:type="spellEnd"/>
                     </w:p>
                     <w:p>
                       <w:pPr>
@@ -2689,34 +2427,14 @@
                           <w:szCs w:val="24"/>
                         </w:rPr>
                       </w:pPr>
-                      <w:proofErr w:type="spellStart"/>
                       <w:r>
                         <w:rPr>
                           <w:rFonts w:ascii="Times New Roman" w:hAnsi="Times New Roman" w:cs="Times New Roman"/>
                           <w:sz w:val="24"/>
                           <w:szCs w:val="24"/>
                         </w:rPr>
-                        <w:t>Ketua</w:t>
+                        <w:t>Ketua Program Studi DIV Teknik Informatika</w:t>
                       </w:r>
-                      <w:proofErr w:type="spellEnd"/>
-                      <w:r>
-                        <w:rPr>
-                          <w:rFonts w:ascii="Times New Roman" w:hAnsi="Times New Roman" w:cs="Times New Roman"/>
-                          <w:sz w:val="24"/>
-                          <w:szCs w:val="24"/>
-                        </w:rPr>
-                        <w:t xml:space="preserve"> Program Studi DIV Teknik </w:t>
-                      </w:r>
-                      <w:proofErr w:type="spellStart"/>
-                      <w:r>
-                        <w:rPr>
-                          <w:rFonts w:ascii="Times New Roman" w:hAnsi="Times New Roman" w:cs="Times New Roman"/>
-                          <w:sz w:val="24"/>
-                          <w:szCs w:val="24"/>
-                        </w:rPr>
-                        <w:t>Informatika</w:t>
-                      </w:r>
-                      <w:proofErr w:type="spellEnd"/>
                     </w:p>
                     <w:p>
                       <w:pPr>
@@ -2766,29 +2484,7 @@
                             <w:sz w:val="24"/>
                             <w:szCs w:val="24"/>
                           </w:rPr>
-                          <w:t xml:space="preserve">Roni Andarsyah, S.T., </w:t>
-                        </w:r>
-                        <w:proofErr w:type="spellStart"/>
-                        <w:r>
-                          <w:rPr>
-                            <w:rStyle w:val="Hyperlink"/>
-                            <w:rFonts w:asciiTheme="majorBidi" w:hAnsiTheme="majorBidi"/>
-                            <w:color w:val="auto"/>
-                            <w:sz w:val="24"/>
-                            <w:szCs w:val="24"/>
-                          </w:rPr>
-                          <w:t>M.Kom</w:t>
-                        </w:r>
-                        <w:proofErr w:type="spellEnd"/>
-                        <w:r>
-                          <w:rPr>
-                            <w:rStyle w:val="Hyperlink"/>
-                            <w:rFonts w:asciiTheme="majorBidi" w:hAnsiTheme="majorBidi"/>
-                            <w:color w:val="auto"/>
-                            <w:sz w:val="24"/>
-                            <w:szCs w:val="24"/>
-                          </w:rPr>
-                          <w:t>., SFPC</w:t>
+                          <w:t>Roni Andarsyah, S.T., M.Kom., SFPC</w:t>
                         </w:r>
                       </w:hyperlink>
                     </w:p>
@@ -2927,7 +2623,7 @@
       <w:bookmarkStart w:id="4" w:name="_Toc187917659"/>
       <w:bookmarkStart w:id="5" w:name="_Toc148615366"/>
       <w:bookmarkStart w:id="6" w:name="_Toc187833463"/>
-      <w:bookmarkStart w:id="7" w:name="_Toc219036860"/>
+      <w:bookmarkStart w:id="7" w:name="_Toc220012242"/>
       <w:r>
         <w:rPr>
           <w:rFonts w:ascii="Times New Roman" w:hAnsi="Times New Roman" w:cs="Times New Roman"/>
@@ -5452,7 +5148,7 @@
       </w:pPr>
       <w:bookmarkStart w:id="11" w:name="_Toc148615368"/>
       <w:bookmarkStart w:id="12" w:name="_Toc187917661"/>
-      <w:bookmarkStart w:id="13" w:name="_Toc219036861"/>
+      <w:bookmarkStart w:id="13" w:name="_Toc220012243"/>
       <w:bookmarkEnd w:id="8"/>
       <w:bookmarkEnd w:id="9"/>
       <w:bookmarkEnd w:id="10"/>
@@ -5808,7 +5504,7 @@
       </w:pPr>
       <w:bookmarkStart w:id="14" w:name="_Toc187917662"/>
       <w:bookmarkStart w:id="15" w:name="_Toc148615369"/>
-      <w:bookmarkStart w:id="16" w:name="_Toc219036862"/>
+      <w:bookmarkStart w:id="16" w:name="_Toc220012244"/>
       <w:r>
         <w:rPr>
           <w:rFonts w:ascii="Times New Roman" w:hAnsi="Times New Roman" w:cs="Times New Roman"/>
@@ -6051,7 +5747,7 @@
             </w:rPr>
             <w:fldChar w:fldCharType="separate"/>
           </w:r>
-          <w:hyperlink w:anchor="_Toc219036859" w:history="1">
+          <w:hyperlink w:anchor="_Toc220012241" w:history="1">
             <w:r>
               <w:rPr>
                 <w:rStyle w:val="Hyperlink"/>
@@ -6079,7 +5775,7 @@
                 <w:noProof/>
                 <w:webHidden/>
               </w:rPr>
-              <w:instrText xml:space="preserve"> PAGEREF _Toc219036859 \h </w:instrText>
+              <w:instrText xml:space="preserve"> PAGEREF _Toc220012241 \h </w:instrText>
             </w:r>
             <w:r>
               <w:rPr>
@@ -6126,7 +5822,7 @@
               <w14:ligatures w14:val="standardContextual"/>
             </w:rPr>
           </w:pPr>
-          <w:hyperlink w:anchor="_Toc219036860" w:history="1">
+          <w:hyperlink w:anchor="_Toc220012242" w:history="1">
             <w:r>
               <w:rPr>
                 <w:rStyle w:val="Hyperlink"/>
@@ -6154,7 +5850,7 @@
                 <w:noProof/>
                 <w:webHidden/>
               </w:rPr>
-              <w:instrText xml:space="preserve"> PAGEREF _Toc219036860 \h </w:instrText>
+              <w:instrText xml:space="preserve"> PAGEREF _Toc220012242 \h </w:instrText>
             </w:r>
             <w:r>
               <w:rPr>
@@ -6201,7 +5897,7 @@
               <w14:ligatures w14:val="standardContextual"/>
             </w:rPr>
           </w:pPr>
-          <w:hyperlink w:anchor="_Toc219036861" w:history="1">
+          <w:hyperlink w:anchor="_Toc220012243" w:history="1">
             <w:r>
               <w:rPr>
                 <w:rStyle w:val="Hyperlink"/>
@@ -6231,7 +5927,7 @@
                 <w:noProof/>
                 <w:webHidden/>
               </w:rPr>
-              <w:instrText xml:space="preserve"> PAGEREF _Toc219036861 \h </w:instrText>
+              <w:instrText xml:space="preserve"> PAGEREF _Toc220012243 \h </w:instrText>
             </w:r>
             <w:r>
               <w:rPr>
@@ -6278,7 +5974,7 @@
               <w14:ligatures w14:val="standardContextual"/>
             </w:rPr>
           </w:pPr>
-          <w:hyperlink w:anchor="_Toc219036862" w:history="1">
+          <w:hyperlink w:anchor="_Toc220012244" w:history="1">
             <w:r>
               <w:rPr>
                 <w:rStyle w:val="Hyperlink"/>
@@ -6310,7 +6006,7 @@
                 <w:noProof/>
                 <w:webHidden/>
               </w:rPr>
-              <w:instrText xml:space="preserve"> PAGEREF _Toc219036862 \h </w:instrText>
+              <w:instrText xml:space="preserve"> PAGEREF _Toc220012244 \h </w:instrText>
             </w:r>
             <w:r>
               <w:rPr>
@@ -6349,8 +6045,6 @@
             </w:tabs>
             <w:rPr>
               <w:rFonts w:eastAsiaTheme="minorEastAsia"/>
-              <w:b/>
-              <w:bCs/>
               <w:noProof/>
               <w:kern w:val="2"/>
               <w:sz w:val="24"/>
@@ -6359,21 +6053,17 @@
               <w14:ligatures w14:val="standardContextual"/>
             </w:rPr>
           </w:pPr>
-          <w:hyperlink w:anchor="_Toc219036863" w:history="1">
+          <w:hyperlink w:anchor="_Toc220012245" w:history="1">
             <w:r>
               <w:rPr>
                 <w:rStyle w:val="Hyperlink"/>
                 <w:rFonts w:ascii="Times New Roman" w:hAnsi="Times New Roman" w:cs="Times New Roman"/>
-                <w:b/>
-                <w:bCs/>
                 <w:noProof/>
               </w:rPr>
               <w:t>DAFTAR GAMBAR</w:t>
             </w:r>
             <w:r>
               <w:rPr>
-                <w:b/>
-                <w:bCs/>
                 <w:noProof/>
                 <w:webHidden/>
               </w:rPr>
@@ -6381,8 +6071,6 @@
             </w:r>
             <w:r>
               <w:rPr>
-                <w:b/>
-                <w:bCs/>
                 <w:noProof/>
                 <w:webHidden/>
               </w:rPr>
@@ -6390,25 +6078,19 @@
             </w:r>
             <w:r>
               <w:rPr>
-                <w:b/>
-                <w:bCs/>
                 <w:noProof/>
                 <w:webHidden/>
               </w:rPr>
-              <w:instrText xml:space="preserve"> PAGEREF _Toc219036863 \h </w:instrText>
+              <w:instrText xml:space="preserve"> PAGEREF _Toc220012245 \h </w:instrText>
             </w:r>
             <w:r>
               <w:rPr>
-                <w:b/>
-                <w:bCs/>
                 <w:noProof/>
                 <w:webHidden/>
               </w:rPr>
             </w:r>
             <w:r>
               <w:rPr>
-                <w:b/>
-                <w:bCs/>
                 <w:noProof/>
                 <w:webHidden/>
               </w:rPr>
@@ -6416,8 +6098,6 @@
             </w:r>
             <w:r>
               <w:rPr>
-                <w:b/>
-                <w:bCs/>
                 <w:noProof/>
                 <w:webHidden/>
               </w:rPr>
@@ -6425,8 +6105,6 @@
             </w:r>
             <w:r>
               <w:rPr>
-                <w:b/>
-                <w:bCs/>
                 <w:noProof/>
                 <w:webHidden/>
               </w:rPr>
@@ -6450,7 +6128,7 @@
               <w14:ligatures w14:val="standardContextual"/>
             </w:rPr>
           </w:pPr>
-          <w:hyperlink w:anchor="_Toc219036864" w:history="1">
+          <w:hyperlink w:anchor="_Toc220012246" w:history="1">
             <w:r>
               <w:rPr>
                 <w:rStyle w:val="Hyperlink"/>
@@ -6480,7 +6158,7 @@
                 <w:noProof/>
                 <w:webHidden/>
               </w:rPr>
-              <w:instrText xml:space="preserve"> PAGEREF _Toc219036864 \h </w:instrText>
+              <w:instrText xml:space="preserve"> PAGEREF _Toc220012246 \h </w:instrText>
             </w:r>
             <w:r>
               <w:rPr>
@@ -6527,7 +6205,7 @@
               <w14:ligatures w14:val="standardContextual"/>
             </w:rPr>
           </w:pPr>
-          <w:hyperlink w:anchor="_Toc219036865" w:history="1">
+          <w:hyperlink w:anchor="_Toc220012247" w:history="1">
             <w:r>
               <w:rPr>
                 <w:rStyle w:val="Hyperlink"/>
@@ -6557,7 +6235,7 @@
                 <w:noProof/>
                 <w:webHidden/>
               </w:rPr>
-              <w:instrText xml:space="preserve"> PAGEREF _Toc219036865 \h </w:instrText>
+              <w:instrText xml:space="preserve"> PAGEREF _Toc220012247 \h </w:instrText>
             </w:r>
             <w:r>
               <w:rPr>
@@ -6604,7 +6282,7 @@
               <w14:ligatures w14:val="standardContextual"/>
             </w:rPr>
           </w:pPr>
-          <w:hyperlink w:anchor="_Toc219036866" w:history="1">
+          <w:hyperlink w:anchor="_Toc220012248" w:history="1">
             <w:r>
               <w:rPr>
                 <w:rStyle w:val="Hyperlink"/>
@@ -6634,7 +6312,7 @@
                 <w:noProof/>
                 <w:webHidden/>
               </w:rPr>
-              <w:instrText xml:space="preserve"> PAGEREF _Toc219036866 \h </w:instrText>
+              <w:instrText xml:space="preserve"> PAGEREF _Toc220012248 \h </w:instrText>
             </w:r>
             <w:r>
               <w:rPr>
@@ -6682,7 +6360,7 @@
               <w14:ligatures w14:val="standardContextual"/>
             </w:rPr>
           </w:pPr>
-          <w:hyperlink w:anchor="_Toc219036867" w:history="1">
+          <w:hyperlink w:anchor="_Toc220012249" w:history="1">
             <w:r>
               <w:rPr>
                 <w:rStyle w:val="Hyperlink"/>
@@ -6734,7 +6412,7 @@
                 <w:noProof/>
                 <w:webHidden/>
               </w:rPr>
-              <w:instrText xml:space="preserve"> PAGEREF _Toc219036867 \h </w:instrText>
+              <w:instrText xml:space="preserve"> PAGEREF _Toc220012249 \h </w:instrText>
             </w:r>
             <w:r>
               <w:rPr>
@@ -6782,7 +6460,7 @@
               <w14:ligatures w14:val="standardContextual"/>
             </w:rPr>
           </w:pPr>
-          <w:hyperlink w:anchor="_Toc219036868" w:history="1">
+          <w:hyperlink w:anchor="_Toc220012250" w:history="1">
             <w:r>
               <w:rPr>
                 <w:rStyle w:val="Hyperlink"/>
@@ -6834,7 +6512,7 @@
                 <w:noProof/>
                 <w:webHidden/>
               </w:rPr>
-              <w:instrText xml:space="preserve"> PAGEREF _Toc219036868 \h </w:instrText>
+              <w:instrText xml:space="preserve"> PAGEREF _Toc220012250 \h </w:instrText>
             </w:r>
             <w:r>
               <w:rPr>
@@ -6882,7 +6560,7 @@
               <w14:ligatures w14:val="standardContextual"/>
             </w:rPr>
           </w:pPr>
-          <w:hyperlink w:anchor="_Toc219036869" w:history="1">
+          <w:hyperlink w:anchor="_Toc220012251" w:history="1">
             <w:r>
               <w:rPr>
                 <w:rStyle w:val="Hyperlink"/>
@@ -6934,7 +6612,7 @@
                 <w:noProof/>
                 <w:webHidden/>
               </w:rPr>
-              <w:instrText xml:space="preserve"> PAGEREF _Toc219036869 \h </w:instrText>
+              <w:instrText xml:space="preserve"> PAGEREF _Toc220012251 \h </w:instrText>
             </w:r>
             <w:r>
               <w:rPr>
@@ -6982,7 +6660,7 @@
               <w14:ligatures w14:val="standardContextual"/>
             </w:rPr>
           </w:pPr>
-          <w:hyperlink w:anchor="_Toc219036870" w:history="1">
+          <w:hyperlink w:anchor="_Toc220012252" w:history="1">
             <w:r>
               <w:rPr>
                 <w:rStyle w:val="Hyperlink"/>
@@ -7034,7 +6712,7 @@
                 <w:noProof/>
                 <w:webHidden/>
               </w:rPr>
-              <w:instrText xml:space="preserve"> PAGEREF _Toc219036870 \h </w:instrText>
+              <w:instrText xml:space="preserve"> PAGEREF _Toc220012252 \h </w:instrText>
             </w:r>
             <w:r>
               <w:rPr>
@@ -7082,7 +6760,7 @@
               <w14:ligatures w14:val="standardContextual"/>
             </w:rPr>
           </w:pPr>
-          <w:hyperlink w:anchor="_Toc219036871" w:history="1">
+          <w:hyperlink w:anchor="_Toc220012253" w:history="1">
             <w:r>
               <w:rPr>
                 <w:rStyle w:val="Hyperlink"/>
@@ -7134,7 +6812,7 @@
                 <w:noProof/>
                 <w:webHidden/>
               </w:rPr>
-              <w:instrText xml:space="preserve"> PAGEREF _Toc219036871 \h </w:instrText>
+              <w:instrText xml:space="preserve"> PAGEREF _Toc220012253 \h </w:instrText>
             </w:r>
             <w:r>
               <w:rPr>
@@ -7181,7 +6859,7 @@
               <w14:ligatures w14:val="standardContextual"/>
             </w:rPr>
           </w:pPr>
-          <w:hyperlink w:anchor="_Toc219036872" w:history="1">
+          <w:hyperlink w:anchor="_Toc220012254" w:history="1">
             <w:r>
               <w:rPr>
                 <w:rStyle w:val="Hyperlink"/>
@@ -7211,7 +6889,7 @@
                 <w:noProof/>
                 <w:webHidden/>
               </w:rPr>
-              <w:instrText xml:space="preserve"> PAGEREF _Toc219036872 \h </w:instrText>
+              <w:instrText xml:space="preserve"> PAGEREF _Toc220012254 \h </w:instrText>
             </w:r>
             <w:r>
               <w:rPr>
@@ -7258,7 +6936,7 @@
               <w14:ligatures w14:val="standardContextual"/>
             </w:rPr>
           </w:pPr>
-          <w:hyperlink w:anchor="_Toc219036873" w:history="1">
+          <w:hyperlink w:anchor="_Toc220012255" w:history="1">
             <w:r>
               <w:rPr>
                 <w:rStyle w:val="Hyperlink"/>
@@ -7288,7 +6966,7 @@
                 <w:noProof/>
                 <w:webHidden/>
               </w:rPr>
-              <w:instrText xml:space="preserve"> PAGEREF _Toc219036873 \h </w:instrText>
+              <w:instrText xml:space="preserve"> PAGEREF _Toc220012255 \h </w:instrText>
             </w:r>
             <w:r>
               <w:rPr>
@@ -7335,7 +7013,7 @@
               <w14:ligatures w14:val="standardContextual"/>
             </w:rPr>
           </w:pPr>
-          <w:hyperlink w:anchor="_Toc219036874" w:history="1">
+          <w:hyperlink w:anchor="_Toc220012256" w:history="1">
             <w:r>
               <w:rPr>
                 <w:rStyle w:val="Hyperlink"/>
@@ -7366,7 +7044,7 @@
                 <w:noProof/>
                 <w:webHidden/>
               </w:rPr>
-              <w:instrText xml:space="preserve"> PAGEREF _Toc219036874 \h </w:instrText>
+              <w:instrText xml:space="preserve"> PAGEREF _Toc220012256 \h </w:instrText>
             </w:r>
             <w:r>
               <w:rPr>
@@ -7413,7 +7091,7 @@
               <w14:ligatures w14:val="standardContextual"/>
             </w:rPr>
           </w:pPr>
-          <w:hyperlink w:anchor="_Toc219036875" w:history="1">
+          <w:hyperlink w:anchor="_Toc220012257" w:history="1">
             <w:r>
               <w:rPr>
                 <w:rStyle w:val="Hyperlink"/>
@@ -7475,7 +7153,7 @@
                 <w:noProof/>
                 <w:webHidden/>
               </w:rPr>
-              <w:instrText xml:space="preserve"> PAGEREF _Toc219036875 \h </w:instrText>
+              <w:instrText xml:space="preserve"> PAGEREF _Toc220012257 \h </w:instrText>
             </w:r>
             <w:r>
               <w:rPr>
@@ -7522,7 +7200,7 @@
               <w14:ligatures w14:val="standardContextual"/>
             </w:rPr>
           </w:pPr>
-          <w:hyperlink w:anchor="_Toc219036876" w:history="1">
+          <w:hyperlink w:anchor="_Toc220012258" w:history="1">
             <w:r>
               <w:rPr>
                 <w:rStyle w:val="Hyperlink"/>
@@ -7552,7 +7230,7 @@
                 <w:noProof/>
                 <w:webHidden/>
               </w:rPr>
-              <w:instrText xml:space="preserve"> PAGEREF _Toc219036876 \h </w:instrText>
+              <w:instrText xml:space="preserve"> PAGEREF _Toc220012258 \h </w:instrText>
             </w:r>
             <w:r>
               <w:rPr>
@@ -7599,7 +7277,7 @@
               <w14:ligatures w14:val="standardContextual"/>
             </w:rPr>
           </w:pPr>
-          <w:hyperlink w:anchor="_Toc219036877" w:history="1">
+          <w:hyperlink w:anchor="_Toc220012259" w:history="1">
             <w:r>
               <w:rPr>
                 <w:rStyle w:val="Hyperlink"/>
@@ -7629,7 +7307,7 @@
                 <w:noProof/>
                 <w:webHidden/>
               </w:rPr>
-              <w:instrText xml:space="preserve"> PAGEREF _Toc219036877 \h </w:instrText>
+              <w:instrText xml:space="preserve"> PAGEREF _Toc220012259 \h </w:instrText>
             </w:r>
             <w:r>
               <w:rPr>
@@ -7677,7 +7355,7 @@
               <w14:ligatures w14:val="standardContextual"/>
             </w:rPr>
           </w:pPr>
-          <w:hyperlink w:anchor="_Toc219036878" w:history="1">
+          <w:hyperlink w:anchor="_Toc220012260" w:history="1">
             <w:r>
               <w:rPr>
                 <w:rStyle w:val="Hyperlink"/>
@@ -7729,7 +7407,7 @@
                 <w:noProof/>
                 <w:webHidden/>
               </w:rPr>
-              <w:instrText xml:space="preserve"> PAGEREF _Toc219036878 \h </w:instrText>
+              <w:instrText xml:space="preserve"> PAGEREF _Toc220012260 \h </w:instrText>
             </w:r>
             <w:r>
               <w:rPr>
@@ -7777,7 +7455,7 @@
               <w14:ligatures w14:val="standardContextual"/>
             </w:rPr>
           </w:pPr>
-          <w:hyperlink w:anchor="_Toc219036879" w:history="1">
+          <w:hyperlink w:anchor="_Toc220012261" w:history="1">
             <w:r>
               <w:rPr>
                 <w:rStyle w:val="Hyperlink"/>
@@ -7829,7 +7507,7 @@
                 <w:noProof/>
                 <w:webHidden/>
               </w:rPr>
-              <w:instrText xml:space="preserve"> PAGEREF _Toc219036879 \h </w:instrText>
+              <w:instrText xml:space="preserve"> PAGEREF _Toc220012261 \h </w:instrText>
             </w:r>
             <w:r>
               <w:rPr>
@@ -7877,7 +7555,7 @@
               <w14:ligatures w14:val="standardContextual"/>
             </w:rPr>
           </w:pPr>
-          <w:hyperlink w:anchor="_Toc219036880" w:history="1">
+          <w:hyperlink w:anchor="_Toc220012262" w:history="1">
             <w:r>
               <w:rPr>
                 <w:rStyle w:val="Hyperlink"/>
@@ -7929,7 +7607,7 @@
                 <w:noProof/>
                 <w:webHidden/>
               </w:rPr>
-              <w:instrText xml:space="preserve"> PAGEREF _Toc219036880 \h </w:instrText>
+              <w:instrText xml:space="preserve"> PAGEREF _Toc220012262 \h </w:instrText>
             </w:r>
             <w:r>
               <w:rPr>
@@ -7976,7 +7654,7 @@
               <w14:ligatures w14:val="standardContextual"/>
             </w:rPr>
           </w:pPr>
-          <w:hyperlink w:anchor="_Toc219036881" w:history="1">
+          <w:hyperlink w:anchor="_Toc220012263" w:history="1">
             <w:r>
               <w:rPr>
                 <w:rStyle w:val="Hyperlink"/>
@@ -8006,7 +7684,7 @@
                 <w:noProof/>
                 <w:webHidden/>
               </w:rPr>
-              <w:instrText xml:space="preserve"> PAGEREF _Toc219036881 \h </w:instrText>
+              <w:instrText xml:space="preserve"> PAGEREF _Toc220012263 \h </w:instrText>
             </w:r>
             <w:r>
               <w:rPr>
@@ -8053,7 +7731,7 @@
               <w14:ligatures w14:val="standardContextual"/>
             </w:rPr>
           </w:pPr>
-          <w:hyperlink w:anchor="_Toc219036882" w:history="1">
+          <w:hyperlink w:anchor="_Toc220012264" w:history="1">
             <w:r>
               <w:rPr>
                 <w:rStyle w:val="Hyperlink"/>
@@ -8083,7 +7761,7 @@
                 <w:noProof/>
                 <w:webHidden/>
               </w:rPr>
-              <w:instrText xml:space="preserve"> PAGEREF _Toc219036882 \h </w:instrText>
+              <w:instrText xml:space="preserve"> PAGEREF _Toc220012264 \h </w:instrText>
             </w:r>
             <w:r>
               <w:rPr>
@@ -8131,7 +7809,7 @@
               <w14:ligatures w14:val="standardContextual"/>
             </w:rPr>
           </w:pPr>
-          <w:hyperlink w:anchor="_Toc219036883" w:history="1">
+          <w:hyperlink w:anchor="_Toc220012265" w:history="1">
             <w:r>
               <w:rPr>
                 <w:rStyle w:val="Hyperlink"/>
@@ -8183,7 +7861,7 @@
                 <w:noProof/>
                 <w:webHidden/>
               </w:rPr>
-              <w:instrText xml:space="preserve"> PAGEREF _Toc219036883 \h </w:instrText>
+              <w:instrText xml:space="preserve"> PAGEREF _Toc220012265 \h </w:instrText>
             </w:r>
             <w:r>
               <w:rPr>
@@ -8231,7 +7909,7 @@
               <w14:ligatures w14:val="standardContextual"/>
             </w:rPr>
           </w:pPr>
-          <w:hyperlink w:anchor="_Toc219036884" w:history="1">
+          <w:hyperlink w:anchor="_Toc220012266" w:history="1">
             <w:r>
               <w:rPr>
                 <w:rStyle w:val="Hyperlink"/>
@@ -8283,7 +7961,7 @@
                 <w:noProof/>
                 <w:webHidden/>
               </w:rPr>
-              <w:instrText xml:space="preserve"> PAGEREF _Toc219036884 \h </w:instrText>
+              <w:instrText xml:space="preserve"> PAGEREF _Toc220012266 \h </w:instrText>
             </w:r>
             <w:r>
               <w:rPr>
@@ -8331,7 +8009,7 @@
               <w14:ligatures w14:val="standardContextual"/>
             </w:rPr>
           </w:pPr>
-          <w:hyperlink w:anchor="_Toc219036885" w:history="1">
+          <w:hyperlink w:anchor="_Toc220012267" w:history="1">
             <w:r>
               <w:rPr>
                 <w:rStyle w:val="Hyperlink"/>
@@ -8383,7 +8061,7 @@
                 <w:noProof/>
                 <w:webHidden/>
               </w:rPr>
-              <w:instrText xml:space="preserve"> PAGEREF _Toc219036885 \h </w:instrText>
+              <w:instrText xml:space="preserve"> PAGEREF _Toc220012267 \h </w:instrText>
             </w:r>
             <w:r>
               <w:rPr>
@@ -8403,7 +8081,7 @@
                 <w:noProof/>
                 <w:webHidden/>
               </w:rPr>
-              <w:t>26</w:t>
+              <w:t>27</w:t>
             </w:r>
             <w:r>
               <w:rPr>
@@ -8430,7 +8108,7 @@
               <w14:ligatures w14:val="standardContextual"/>
             </w:rPr>
           </w:pPr>
-          <w:hyperlink w:anchor="_Toc219036886" w:history="1">
+          <w:hyperlink w:anchor="_Toc220012268" w:history="1">
             <w:r>
               <w:rPr>
                 <w:rStyle w:val="Hyperlink"/>
@@ -8460,7 +8138,7 @@
                 <w:noProof/>
                 <w:webHidden/>
               </w:rPr>
-              <w:instrText xml:space="preserve"> PAGEREF _Toc219036886 \h </w:instrText>
+              <w:instrText xml:space="preserve"> PAGEREF _Toc220012268 \h </w:instrText>
             </w:r>
             <w:r>
               <w:rPr>
@@ -8507,7 +8185,7 @@
               <w14:ligatures w14:val="standardContextual"/>
             </w:rPr>
           </w:pPr>
-          <w:hyperlink w:anchor="_Toc219036887" w:history="1">
+          <w:hyperlink w:anchor="_Toc220012269" w:history="1">
             <w:r>
               <w:rPr>
                 <w:rStyle w:val="Hyperlink"/>
@@ -8537,7 +8215,7 @@
                 <w:noProof/>
                 <w:webHidden/>
               </w:rPr>
-              <w:instrText xml:space="preserve"> PAGEREF _Toc219036887 \h </w:instrText>
+              <w:instrText xml:space="preserve"> PAGEREF _Toc220012269 \h </w:instrText>
             </w:r>
             <w:r>
               <w:rPr>
@@ -8585,7 +8263,7 @@
               <w14:ligatures w14:val="standardContextual"/>
             </w:rPr>
           </w:pPr>
-          <w:hyperlink w:anchor="_Toc219036888" w:history="1">
+          <w:hyperlink w:anchor="_Toc220012270" w:history="1">
             <w:r>
               <w:rPr>
                 <w:rStyle w:val="Hyperlink"/>
@@ -8637,7 +8315,7 @@
                 <w:noProof/>
                 <w:webHidden/>
               </w:rPr>
-              <w:instrText xml:space="preserve"> PAGEREF _Toc219036888 \h </w:instrText>
+              <w:instrText xml:space="preserve"> PAGEREF _Toc220012270 \h </w:instrText>
             </w:r>
             <w:r>
               <w:rPr>
@@ -8685,7 +8363,7 @@
               <w14:ligatures w14:val="standardContextual"/>
             </w:rPr>
           </w:pPr>
-          <w:hyperlink w:anchor="_Toc219036889" w:history="1">
+          <w:hyperlink w:anchor="_Toc220012271" w:history="1">
             <w:r>
               <w:rPr>
                 <w:rStyle w:val="Hyperlink"/>
@@ -8737,7 +8415,7 @@
                 <w:noProof/>
                 <w:webHidden/>
               </w:rPr>
-              <w:instrText xml:space="preserve"> PAGEREF _Toc219036889 \h </w:instrText>
+              <w:instrText xml:space="preserve"> PAGEREF _Toc220012271 \h </w:instrText>
             </w:r>
             <w:r>
               <w:rPr>
@@ -8784,7 +8462,7 @@
               <w14:ligatures w14:val="standardContextual"/>
             </w:rPr>
           </w:pPr>
-          <w:hyperlink w:anchor="_Toc219036890" w:history="1">
+          <w:hyperlink w:anchor="_Toc220012272" w:history="1">
             <w:r>
               <w:rPr>
                 <w:rStyle w:val="Hyperlink"/>
@@ -8812,7 +8490,7 @@
                 <w:noProof/>
                 <w:webHidden/>
               </w:rPr>
-              <w:instrText xml:space="preserve"> PAGEREF _Toc219036890 \h </w:instrText>
+              <w:instrText xml:space="preserve"> PAGEREF _Toc220012272 \h </w:instrText>
             </w:r>
             <w:r>
               <w:rPr>
@@ -8859,7 +8537,7 @@
               <w14:ligatures w14:val="standardContextual"/>
             </w:rPr>
           </w:pPr>
-          <w:hyperlink w:anchor="_Toc219036891" w:history="1">
+          <w:hyperlink w:anchor="_Toc220012273" w:history="1">
             <w:r>
               <w:rPr>
                 <w:rStyle w:val="Hyperlink"/>
@@ -8887,7 +8565,7 @@
                 <w:noProof/>
                 <w:webHidden/>
               </w:rPr>
-              <w:instrText xml:space="preserve"> PAGEREF _Toc219036891 \h </w:instrText>
+              <w:instrText xml:space="preserve"> PAGEREF _Toc220012273 \h </w:instrText>
             </w:r>
             <w:r>
               <w:rPr>
@@ -8934,7 +8612,7 @@
               <w14:ligatures w14:val="standardContextual"/>
             </w:rPr>
           </w:pPr>
-          <w:hyperlink w:anchor="_Toc219036892" w:history="1">
+          <w:hyperlink w:anchor="_Toc220012274" w:history="1">
             <w:r>
               <w:rPr>
                 <w:rStyle w:val="Hyperlink"/>
@@ -8962,7 +8640,7 @@
                 <w:noProof/>
                 <w:webHidden/>
               </w:rPr>
-              <w:instrText xml:space="preserve"> PAGEREF _Toc219036892 \h </w:instrText>
+              <w:instrText xml:space="preserve"> PAGEREF _Toc220012274 \h </w:instrText>
             </w:r>
             <w:r>
               <w:rPr>
@@ -9025,7 +8703,7 @@
           <w:szCs w:val="28"/>
         </w:rPr>
       </w:pPr>
-      <w:bookmarkStart w:id="18" w:name="_Toc219036863"/>
+      <w:bookmarkStart w:id="18" w:name="_Toc220012245"/>
       <w:r>
         <w:rPr>
           <w:rFonts w:ascii="Times New Roman" w:hAnsi="Times New Roman" w:cs="Times New Roman"/>
@@ -9891,7 +9569,7 @@
         </w:rPr>
       </w:pPr>
       <w:bookmarkStart w:id="19" w:name="_Toc187917664"/>
-      <w:bookmarkStart w:id="20" w:name="_Toc219036864"/>
+      <w:bookmarkStart w:id="20" w:name="_Toc220012246"/>
       <w:r>
         <w:rPr>
           <w:rFonts w:ascii="Times New Roman" w:hAnsi="Times New Roman" w:cs="Times New Roman"/>
@@ -10056,7 +9734,7 @@
         </w:rPr>
       </w:pPr>
       <w:bookmarkStart w:id="21" w:name="_Toc187917665"/>
-      <w:bookmarkStart w:id="22" w:name="_Toc219036865"/>
+      <w:bookmarkStart w:id="22" w:name="_Toc220012247"/>
       <w:r>
         <w:rPr>
           <w:rFonts w:ascii="Times New Roman" w:hAnsi="Times New Roman" w:cs="Times New Roman"/>
@@ -10086,7 +9764,7 @@
         </w:rPr>
       </w:pPr>
       <w:bookmarkStart w:id="23" w:name="_Toc2995"/>
-      <w:bookmarkStart w:id="24" w:name="_Toc219036866"/>
+      <w:bookmarkStart w:id="24" w:name="_Toc220012248"/>
       <w:r>
         <w:rPr>
           <w:rFonts w:ascii="Times New Roman" w:hAnsi="Times New Roman" w:cs="Times New Roman"/>
@@ -10120,7 +9798,7 @@
         </w:rPr>
       </w:pPr>
       <w:bookmarkStart w:id="25" w:name="_Toc187917666"/>
-      <w:bookmarkStart w:id="26" w:name="_Toc219036867"/>
+      <w:bookmarkStart w:id="26" w:name="_Toc220012249"/>
       <w:r>
         <w:rPr>
           <w:rFonts w:ascii="Times New Roman" w:hAnsi="Times New Roman" w:cs="Times New Roman"/>
@@ -10351,7 +10029,7 @@
         </w:rPr>
       </w:pPr>
       <w:bookmarkStart w:id="27" w:name="_Toc187917667"/>
-      <w:bookmarkStart w:id="28" w:name="_Toc219036868"/>
+      <w:bookmarkStart w:id="28" w:name="_Toc220012250"/>
       <w:proofErr w:type="spellStart"/>
       <w:r>
         <w:rPr>
@@ -10507,7 +10185,7 @@
         </w:rPr>
       </w:pPr>
       <w:bookmarkStart w:id="29" w:name="_Toc187917668"/>
-      <w:bookmarkStart w:id="30" w:name="_Toc219036869"/>
+      <w:bookmarkStart w:id="30" w:name="_Toc220012251"/>
       <w:r>
         <w:rPr>
           <w:rFonts w:ascii="Times New Roman" w:hAnsi="Times New Roman" w:cs="Times New Roman"/>
@@ -11101,7 +10779,7 @@
         </w:rPr>
       </w:pPr>
       <w:bookmarkStart w:id="31" w:name="_Toc187917669"/>
-      <w:bookmarkStart w:id="32" w:name="_Toc219036870"/>
+      <w:bookmarkStart w:id="32" w:name="_Toc220012252"/>
       <w:r>
         <w:rPr>
           <w:rFonts w:ascii="Times New Roman" w:hAnsi="Times New Roman" w:cs="Times New Roman"/>
@@ -12112,7 +11790,7 @@
         </w:rPr>
       </w:pPr>
       <w:bookmarkStart w:id="33" w:name="_Toc187917670"/>
-      <w:bookmarkStart w:id="34" w:name="_Toc219036871"/>
+      <w:bookmarkStart w:id="34" w:name="_Toc220012253"/>
       <w:proofErr w:type="spellStart"/>
       <w:r>
         <w:rPr>
@@ -12527,7 +12205,7 @@
           <w:szCs w:val="32"/>
         </w:rPr>
       </w:pPr>
-      <w:bookmarkStart w:id="35" w:name="_Toc219036872"/>
+      <w:bookmarkStart w:id="35" w:name="_Toc220012254"/>
       <w:r>
         <w:rPr>
           <w:rFonts w:ascii="Times New Roman" w:eastAsia="DengXian Light" w:hAnsi="Times New Roman" w:cs="Times New Roman"/>
@@ -12555,7 +12233,7 @@
           <w:szCs w:val="32"/>
         </w:rPr>
       </w:pPr>
-      <w:bookmarkStart w:id="36" w:name="_Toc219036873"/>
+      <w:bookmarkStart w:id="36" w:name="_Toc220012255"/>
       <w:r>
         <w:rPr>
           <w:rFonts w:ascii="Times New Roman" w:eastAsia="Calibri" w:hAnsi="Times New Roman" w:cs="Times New Roman"/>
@@ -12583,7 +12261,7 @@
           <w:lang w:val="zh-CN"/>
         </w:rPr>
       </w:pPr>
-      <w:bookmarkStart w:id="37" w:name="_Toc219036874"/>
+      <w:bookmarkStart w:id="37" w:name="_Toc220012256"/>
       <w:r>
         <w:rPr>
           <w:rFonts w:ascii="Times New Roman" w:eastAsia="DengXian Light" w:hAnsi="Times New Roman" w:cs="Times New Roman"/>
@@ -13236,7 +12914,7 @@
           <w:szCs w:val="32"/>
         </w:rPr>
       </w:pPr>
-      <w:bookmarkStart w:id="38" w:name="_Toc219036875"/>
+      <w:bookmarkStart w:id="38" w:name="_Toc220012257"/>
       <w:r>
         <w:rPr>
           <w:rFonts w:ascii="Times New Roman" w:eastAsia="DengXian Light" w:hAnsi="Times New Roman" w:cs="Times New Roman"/>
@@ -13996,7 +13674,7 @@
         <w:pStyle w:val="Heading1"/>
         <w:jc w:val="center"/>
       </w:pPr>
-      <w:bookmarkStart w:id="40" w:name="_Toc219036876"/>
+      <w:bookmarkStart w:id="40" w:name="_Toc220012258"/>
       <w:r>
         <w:rPr>
           <w:rFonts w:ascii="Times New Roman" w:hAnsi="Times New Roman" w:cs="Times New Roman"/>
@@ -14024,7 +13702,7 @@
           <w:szCs w:val="32"/>
         </w:rPr>
       </w:pPr>
-      <w:bookmarkStart w:id="41" w:name="_Toc219036877"/>
+      <w:bookmarkStart w:id="41" w:name="_Toc220012259"/>
       <w:r>
         <w:rPr>
           <w:rFonts w:ascii="Times New Roman" w:hAnsi="Times New Roman" w:cs="Times New Roman"/>
@@ -14055,7 +13733,7 @@
           <w:szCs w:val="24"/>
         </w:rPr>
       </w:pPr>
-      <w:bookmarkStart w:id="42" w:name="_Toc219036878"/>
+      <w:bookmarkStart w:id="42" w:name="_Toc220012260"/>
       <w:proofErr w:type="spellStart"/>
       <w:r>
         <w:rPr>
@@ -14847,7 +14525,7 @@
           <w:szCs w:val="24"/>
         </w:rPr>
       </w:pPr>
-      <w:bookmarkStart w:id="44" w:name="_Toc219036879"/>
+      <w:bookmarkStart w:id="44" w:name="_Toc220012261"/>
       <w:proofErr w:type="spellStart"/>
       <w:r>
         <w:rPr>
@@ -16959,7 +16637,7 @@
           <w:szCs w:val="24"/>
         </w:rPr>
       </w:pPr>
-      <w:bookmarkStart w:id="45" w:name="_Toc219036880"/>
+      <w:bookmarkStart w:id="45" w:name="_Toc220012262"/>
       <w:proofErr w:type="spellStart"/>
       <w:r>
         <w:rPr>
@@ -17491,7 +17169,7 @@
           <w:noProof/>
         </w:rPr>
         <w:drawing>
-          <wp:inline distT="0" distB="0" distL="0" distR="0" wp14:anchorId="453E3C7E" wp14:editId="09BF90DA">
+          <wp:inline distT="0" distB="0" distL="0" distR="0" wp14:anchorId="453E3C7E" wp14:editId="4DAADEB1">
             <wp:extent cx="5658610" cy="5076825"/>
             <wp:effectExtent l="0" t="0" r="0" b="0"/>
             <wp:docPr id="422238300" name="Picture 7"/>
@@ -18027,7 +17705,7 @@
         </w:rPr>
         <w:lastRenderedPageBreak/>
         <w:drawing>
-          <wp:inline distT="0" distB="0" distL="0" distR="0" wp14:anchorId="576AF68F" wp14:editId="73286BA3">
+          <wp:inline distT="0" distB="0" distL="0" distR="0" wp14:anchorId="576AF68F" wp14:editId="41B81282">
             <wp:extent cx="3867150" cy="8546181"/>
             <wp:effectExtent l="0" t="0" r="0" b="7620"/>
             <wp:docPr id="651211961" name="Picture 13"/>
@@ -18530,7 +18208,7 @@
           <w:noProof/>
         </w:rPr>
         <w:drawing>
-          <wp:inline distT="0" distB="0" distL="0" distR="0" wp14:anchorId="59209B85" wp14:editId="6F7BB3C8">
+          <wp:inline distT="0" distB="0" distL="0" distR="0" wp14:anchorId="59209B85" wp14:editId="5A1DBBBC">
             <wp:extent cx="5467350" cy="3095904"/>
             <wp:effectExtent l="0" t="0" r="0" b="9525"/>
             <wp:docPr id="897860536" name="Picture 9"/>
@@ -18745,7 +18423,7 @@
           <w:noProof/>
         </w:rPr>
         <w:drawing>
-          <wp:inline distT="0" distB="0" distL="0" distR="0" wp14:anchorId="0FCA970C" wp14:editId="12089D00">
+          <wp:inline distT="0" distB="0" distL="0" distR="0" wp14:anchorId="0FCA970C" wp14:editId="088464DA">
             <wp:extent cx="3702962" cy="3200400"/>
             <wp:effectExtent l="0" t="0" r="0" b="0"/>
             <wp:docPr id="1726746046" name="Picture 10"/>
@@ -19246,7 +18924,7 @@
           <w:noProof/>
         </w:rPr>
         <w:drawing>
-          <wp:inline distT="0" distB="0" distL="0" distR="0" wp14:anchorId="17C943E0" wp14:editId="13872736">
+          <wp:inline distT="0" distB="0" distL="0" distR="0" wp14:anchorId="17C943E0" wp14:editId="60D9399F">
             <wp:extent cx="1647825" cy="3943148"/>
             <wp:effectExtent l="0" t="0" r="0" b="635"/>
             <wp:docPr id="558490596" name="Picture 14"/>
@@ -22990,7 +22668,7 @@
           <w:szCs w:val="32"/>
         </w:rPr>
       </w:pPr>
-      <w:bookmarkStart w:id="53" w:name="_Toc219036881"/>
+      <w:bookmarkStart w:id="53" w:name="_Toc220012263"/>
       <w:r>
         <w:rPr>
           <w:rFonts w:ascii="Times New Roman" w:hAnsi="Times New Roman" w:cs="Times New Roman"/>
@@ -23019,7 +22697,7 @@
           <w:szCs w:val="32"/>
         </w:rPr>
       </w:pPr>
-      <w:bookmarkStart w:id="54" w:name="_Toc219036882"/>
+      <w:bookmarkStart w:id="54" w:name="_Toc220012264"/>
       <w:r>
         <w:rPr>
           <w:rFonts w:ascii="Times New Roman" w:hAnsi="Times New Roman" w:cs="Times New Roman"/>
@@ -23049,7 +22727,7 @@
           <w:szCs w:val="24"/>
         </w:rPr>
       </w:pPr>
-      <w:bookmarkStart w:id="55" w:name="_Toc219036883"/>
+      <w:bookmarkStart w:id="55" w:name="_Toc220012265"/>
       <w:proofErr w:type="spellStart"/>
       <w:r>
         <w:rPr>
@@ -24439,7 +24117,7 @@
           <w:szCs w:val="24"/>
         </w:rPr>
       </w:pPr>
-      <w:bookmarkStart w:id="56" w:name="_Toc219036884"/>
+      <w:bookmarkStart w:id="56" w:name="_Toc220012266"/>
       <w:proofErr w:type="spellStart"/>
       <w:r>
         <w:rPr>
@@ -26048,9 +25726,6 @@
       <w:pPr>
         <w:pStyle w:val="Caption"/>
         <w:jc w:val="center"/>
-        <w:rPr>
-          <w:rFonts w:ascii="Times New Roman" w:hAnsi="Times New Roman" w:cs="Times New Roman"/>
-        </w:rPr>
       </w:pPr>
       <w:bookmarkStart w:id="57" w:name="_Toc219036646"/>
       <w:r>
@@ -26087,15 +25762,7 @@
       </w:r>
       <w:bookmarkEnd w:id="57"/>
     </w:p>
-    <w:p>
-      <w:pPr>
-        <w:ind w:left="1800" w:hanging="1800"/>
-        <w:jc w:val="both"/>
-        <w:rPr>
-          <w:rFonts w:ascii="Times New Roman" w:hAnsi="Times New Roman" w:cs="Times New Roman"/>
-        </w:rPr>
-      </w:pPr>
-    </w:p>
+    <w:p/>
     <w:p>
       <w:pPr>
         <w:pStyle w:val="ListParagraph"/>
@@ -26120,7 +25787,7 @@
     </w:p>
     <w:p>
       <w:pPr>
-        <w:ind w:left="1800"/>
+        <w:ind w:left="1797"/>
         <w:jc w:val="both"/>
         <w:rPr>
           <w:rFonts w:ascii="Times New Roman" w:hAnsi="Times New Roman" w:cs="Times New Roman"/>
@@ -26130,14 +25797,14 @@
         <w:rPr>
           <w:rFonts w:ascii="Times New Roman" w:hAnsi="Times New Roman" w:cs="Times New Roman"/>
         </w:rPr>
-        <w:t xml:space="preserve">Halaman dashboard admin (dashboard.html) </w:t>
-      </w:r>
-      <w:proofErr w:type="spellStart"/>
-      <w:r>
-        <w:rPr>
-          <w:rFonts w:ascii="Times New Roman" w:hAnsi="Times New Roman" w:cs="Times New Roman"/>
-        </w:rPr>
-        <w:t>dibuat</w:t>
+        <w:t xml:space="preserve">Halaman dashboard admin </w:t>
+      </w:r>
+      <w:proofErr w:type="spellStart"/>
+      <w:r>
+        <w:rPr>
+          <w:rFonts w:ascii="Times New Roman" w:hAnsi="Times New Roman" w:cs="Times New Roman"/>
+        </w:rPr>
+        <w:t>dirancang</w:t>
       </w:r>
       <w:proofErr w:type="spellEnd"/>
       <w:r>
@@ -26179,7 +25846,399 @@
         <w:rPr>
           <w:rFonts w:ascii="Times New Roman" w:hAnsi="Times New Roman" w:cs="Times New Roman"/>
         </w:rPr>
-        <w:t>manajemen</w:t>
+        <w:t>kendali</w:t>
+      </w:r>
+      <w:proofErr w:type="spellEnd"/>
+      <w:r>
+        <w:rPr>
+          <w:rFonts w:ascii="Times New Roman" w:hAnsi="Times New Roman" w:cs="Times New Roman"/>
+        </w:rPr>
+        <w:t xml:space="preserve"> </w:t>
+      </w:r>
+      <w:proofErr w:type="spellStart"/>
+      <w:r>
+        <w:rPr>
+          <w:rFonts w:ascii="Times New Roman" w:hAnsi="Times New Roman" w:cs="Times New Roman"/>
+        </w:rPr>
+        <w:t>operasional</w:t>
+      </w:r>
+      <w:proofErr w:type="spellEnd"/>
+      <w:r>
+        <w:rPr>
+          <w:rFonts w:ascii="Times New Roman" w:hAnsi="Times New Roman" w:cs="Times New Roman"/>
+        </w:rPr>
+        <w:t xml:space="preserve"> dan </w:t>
+      </w:r>
+      <w:proofErr w:type="spellStart"/>
+      <w:r>
+        <w:rPr>
+          <w:rFonts w:ascii="Times New Roman" w:hAnsi="Times New Roman" w:cs="Times New Roman"/>
+        </w:rPr>
+        <w:t>pemantauan</w:t>
+      </w:r>
+      <w:proofErr w:type="spellEnd"/>
+      <w:r>
+        <w:rPr>
+          <w:rFonts w:ascii="Times New Roman" w:hAnsi="Times New Roman" w:cs="Times New Roman"/>
+        </w:rPr>
+        <w:t xml:space="preserve"> </w:t>
+      </w:r>
+      <w:proofErr w:type="spellStart"/>
+      <w:r>
+        <w:rPr>
+          <w:rFonts w:ascii="Times New Roman" w:hAnsi="Times New Roman" w:cs="Times New Roman"/>
+        </w:rPr>
+        <w:t>interaksi</w:t>
+      </w:r>
+      <w:proofErr w:type="spellEnd"/>
+      <w:r>
+        <w:rPr>
+          <w:rFonts w:ascii="Times New Roman" w:hAnsi="Times New Roman" w:cs="Times New Roman"/>
+        </w:rPr>
+        <w:t xml:space="preserve"> omni-channel yang </w:t>
+      </w:r>
+      <w:proofErr w:type="spellStart"/>
+      <w:r>
+        <w:rPr>
+          <w:rFonts w:ascii="Times New Roman" w:hAnsi="Times New Roman" w:cs="Times New Roman"/>
+        </w:rPr>
+        <w:t>terintegrasi</w:t>
+      </w:r>
+      <w:proofErr w:type="spellEnd"/>
+      <w:r>
+        <w:rPr>
+          <w:rFonts w:ascii="Times New Roman" w:hAnsi="Times New Roman" w:cs="Times New Roman"/>
+        </w:rPr>
+        <w:t xml:space="preserve"> </w:t>
+      </w:r>
+      <w:proofErr w:type="spellStart"/>
+      <w:r>
+        <w:rPr>
+          <w:rFonts w:ascii="Times New Roman" w:hAnsi="Times New Roman" w:cs="Times New Roman"/>
+        </w:rPr>
+        <w:t>melalui</w:t>
+      </w:r>
+      <w:proofErr w:type="spellEnd"/>
+      <w:r>
+        <w:rPr>
+          <w:rFonts w:ascii="Times New Roman" w:hAnsi="Times New Roman" w:cs="Times New Roman"/>
+        </w:rPr>
+        <w:t xml:space="preserve"> </w:t>
+      </w:r>
+      <w:proofErr w:type="spellStart"/>
+      <w:r>
+        <w:rPr>
+          <w:rFonts w:ascii="Times New Roman" w:hAnsi="Times New Roman" w:cs="Times New Roman"/>
+        </w:rPr>
+        <w:t>sistem</w:t>
+      </w:r>
+      <w:proofErr w:type="spellEnd"/>
+      <w:r>
+        <w:rPr>
+          <w:rFonts w:ascii="Times New Roman" w:hAnsi="Times New Roman" w:cs="Times New Roman"/>
+        </w:rPr>
+        <w:t xml:space="preserve"> </w:t>
+      </w:r>
+      <w:proofErr w:type="spellStart"/>
+      <w:r>
+        <w:rPr>
+          <w:rFonts w:ascii="Times New Roman" w:hAnsi="Times New Roman" w:cs="Times New Roman"/>
+        </w:rPr>
+        <w:t>navigasi</w:t>
+      </w:r>
+      <w:proofErr w:type="spellEnd"/>
+      <w:r>
+        <w:rPr>
+          <w:rFonts w:ascii="Times New Roman" w:hAnsi="Times New Roman" w:cs="Times New Roman"/>
+        </w:rPr>
+        <w:t xml:space="preserve"> tab, yang </w:t>
+      </w:r>
+      <w:proofErr w:type="spellStart"/>
+      <w:r>
+        <w:rPr>
+          <w:rFonts w:ascii="Times New Roman" w:hAnsi="Times New Roman" w:cs="Times New Roman"/>
+        </w:rPr>
+        <w:t>mencakup</w:t>
+      </w:r>
+      <w:proofErr w:type="spellEnd"/>
+      <w:r>
+        <w:rPr>
+          <w:rFonts w:ascii="Times New Roman" w:hAnsi="Times New Roman" w:cs="Times New Roman"/>
+        </w:rPr>
+        <w:t xml:space="preserve"> </w:t>
+      </w:r>
+      <w:proofErr w:type="spellStart"/>
+      <w:r>
+        <w:rPr>
+          <w:rFonts w:ascii="Times New Roman" w:hAnsi="Times New Roman" w:cs="Times New Roman"/>
+        </w:rPr>
+        <w:t>modul</w:t>
+      </w:r>
+      <w:proofErr w:type="spellEnd"/>
+      <w:r>
+        <w:rPr>
+          <w:rFonts w:ascii="Times New Roman" w:hAnsi="Times New Roman" w:cs="Times New Roman"/>
+        </w:rPr>
+        <w:t xml:space="preserve"> </w:t>
+      </w:r>
+      <w:proofErr w:type="spellStart"/>
+      <w:r>
+        <w:rPr>
+          <w:rFonts w:ascii="Times New Roman" w:hAnsi="Times New Roman" w:cs="Times New Roman"/>
+        </w:rPr>
+        <w:t>Manajemen</w:t>
+      </w:r>
+      <w:proofErr w:type="spellEnd"/>
+      <w:r>
+        <w:rPr>
+          <w:rFonts w:ascii="Times New Roman" w:hAnsi="Times New Roman" w:cs="Times New Roman"/>
+        </w:rPr>
+        <w:t xml:space="preserve"> User, Riwayat Chat (Web), dan WhatsApp Chat. Pada </w:t>
+      </w:r>
+      <w:proofErr w:type="spellStart"/>
+      <w:r>
+        <w:rPr>
+          <w:rFonts w:ascii="Times New Roman" w:hAnsi="Times New Roman" w:cs="Times New Roman"/>
+        </w:rPr>
+        <w:t>modul</w:t>
+      </w:r>
+      <w:proofErr w:type="spellEnd"/>
+      <w:r>
+        <w:rPr>
+          <w:rFonts w:ascii="Times New Roman" w:hAnsi="Times New Roman" w:cs="Times New Roman"/>
+        </w:rPr>
+        <w:t xml:space="preserve"> </w:t>
+      </w:r>
+      <w:proofErr w:type="spellStart"/>
+      <w:r>
+        <w:rPr>
+          <w:rFonts w:ascii="Times New Roman" w:hAnsi="Times New Roman" w:cs="Times New Roman"/>
+        </w:rPr>
+        <w:t>Manajemen</w:t>
+      </w:r>
+      <w:proofErr w:type="spellEnd"/>
+      <w:r>
+        <w:rPr>
+          <w:rFonts w:ascii="Times New Roman" w:hAnsi="Times New Roman" w:cs="Times New Roman"/>
+        </w:rPr>
+        <w:t xml:space="preserve"> User, administrator </w:t>
+      </w:r>
+      <w:proofErr w:type="spellStart"/>
+      <w:r>
+        <w:rPr>
+          <w:rFonts w:ascii="Times New Roman" w:hAnsi="Times New Roman" w:cs="Times New Roman"/>
+        </w:rPr>
+        <w:t>dapat</w:t>
+      </w:r>
+      <w:proofErr w:type="spellEnd"/>
+      <w:r>
+        <w:rPr>
+          <w:rFonts w:ascii="Times New Roman" w:hAnsi="Times New Roman" w:cs="Times New Roman"/>
+        </w:rPr>
+        <w:t xml:space="preserve"> </w:t>
+      </w:r>
+      <w:proofErr w:type="spellStart"/>
+      <w:r>
+        <w:rPr>
+          <w:rFonts w:ascii="Times New Roman" w:hAnsi="Times New Roman" w:cs="Times New Roman"/>
+        </w:rPr>
+        <w:t>memantau</w:t>
+      </w:r>
+      <w:proofErr w:type="spellEnd"/>
+      <w:r>
+        <w:rPr>
+          <w:rFonts w:ascii="Times New Roman" w:hAnsi="Times New Roman" w:cs="Times New Roman"/>
+        </w:rPr>
+        <w:t xml:space="preserve"> </w:t>
+      </w:r>
+      <w:proofErr w:type="spellStart"/>
+      <w:r>
+        <w:rPr>
+          <w:rFonts w:ascii="Times New Roman" w:hAnsi="Times New Roman" w:cs="Times New Roman"/>
+        </w:rPr>
+        <w:t>metrik</w:t>
+      </w:r>
+      <w:proofErr w:type="spellEnd"/>
+      <w:r>
+        <w:rPr>
+          <w:rFonts w:ascii="Times New Roman" w:hAnsi="Times New Roman" w:cs="Times New Roman"/>
+        </w:rPr>
+        <w:t xml:space="preserve"> </w:t>
+      </w:r>
+      <w:proofErr w:type="spellStart"/>
+      <w:r>
+        <w:rPr>
+          <w:rFonts w:ascii="Times New Roman" w:hAnsi="Times New Roman" w:cs="Times New Roman"/>
+        </w:rPr>
+        <w:t>statistik</w:t>
+      </w:r>
+      <w:proofErr w:type="spellEnd"/>
+      <w:r>
+        <w:rPr>
+          <w:rFonts w:ascii="Times New Roman" w:hAnsi="Times New Roman" w:cs="Times New Roman"/>
+        </w:rPr>
+        <w:t xml:space="preserve"> </w:t>
+      </w:r>
+      <w:proofErr w:type="spellStart"/>
+      <w:r>
+        <w:rPr>
+          <w:rFonts w:ascii="Times New Roman" w:hAnsi="Times New Roman" w:cs="Times New Roman"/>
+        </w:rPr>
+        <w:t>pengguna</w:t>
+      </w:r>
+      <w:proofErr w:type="spellEnd"/>
+      <w:r>
+        <w:rPr>
+          <w:rFonts w:ascii="Times New Roman" w:hAnsi="Times New Roman" w:cs="Times New Roman"/>
+        </w:rPr>
+        <w:t xml:space="preserve"> </w:t>
+      </w:r>
+      <w:proofErr w:type="spellStart"/>
+      <w:r>
+        <w:rPr>
+          <w:rFonts w:ascii="Times New Roman" w:hAnsi="Times New Roman" w:cs="Times New Roman"/>
+        </w:rPr>
+        <w:t>secara</w:t>
+      </w:r>
+      <w:proofErr w:type="spellEnd"/>
+      <w:r>
+        <w:rPr>
+          <w:rFonts w:ascii="Times New Roman" w:hAnsi="Times New Roman" w:cs="Times New Roman"/>
+        </w:rPr>
+        <w:t xml:space="preserve"> real-time </w:t>
+      </w:r>
+      <w:proofErr w:type="spellStart"/>
+      <w:r>
+        <w:rPr>
+          <w:rFonts w:ascii="Times New Roman" w:hAnsi="Times New Roman" w:cs="Times New Roman"/>
+        </w:rPr>
+        <w:t>serta</w:t>
+      </w:r>
+      <w:proofErr w:type="spellEnd"/>
+      <w:r>
+        <w:rPr>
+          <w:rFonts w:ascii="Times New Roman" w:hAnsi="Times New Roman" w:cs="Times New Roman"/>
+        </w:rPr>
+        <w:t xml:space="preserve"> </w:t>
+      </w:r>
+      <w:proofErr w:type="spellStart"/>
+      <w:r>
+        <w:rPr>
+          <w:rFonts w:ascii="Times New Roman" w:hAnsi="Times New Roman" w:cs="Times New Roman"/>
+        </w:rPr>
+        <w:t>melakukan</w:t>
+      </w:r>
+      <w:proofErr w:type="spellEnd"/>
+      <w:r>
+        <w:rPr>
+          <w:rFonts w:ascii="Times New Roman" w:hAnsi="Times New Roman" w:cs="Times New Roman"/>
+        </w:rPr>
+        <w:t xml:space="preserve"> </w:t>
+      </w:r>
+      <w:proofErr w:type="spellStart"/>
+      <w:r>
+        <w:rPr>
+          <w:rFonts w:ascii="Times New Roman" w:hAnsi="Times New Roman" w:cs="Times New Roman"/>
+        </w:rPr>
+        <w:t>kontrol</w:t>
+      </w:r>
+      <w:proofErr w:type="spellEnd"/>
+      <w:r>
+        <w:rPr>
+          <w:rFonts w:ascii="Times New Roman" w:hAnsi="Times New Roman" w:cs="Times New Roman"/>
+        </w:rPr>
+        <w:t xml:space="preserve"> </w:t>
+      </w:r>
+      <w:proofErr w:type="spellStart"/>
+      <w:r>
+        <w:rPr>
+          <w:rFonts w:ascii="Times New Roman" w:hAnsi="Times New Roman" w:cs="Times New Roman"/>
+        </w:rPr>
+        <w:t>akses</w:t>
+      </w:r>
+      <w:proofErr w:type="spellEnd"/>
+      <w:r>
+        <w:rPr>
+          <w:rFonts w:ascii="Times New Roman" w:hAnsi="Times New Roman" w:cs="Times New Roman"/>
+        </w:rPr>
+        <w:t xml:space="preserve"> dan </w:t>
+      </w:r>
+      <w:proofErr w:type="spellStart"/>
+      <w:r>
+        <w:rPr>
+          <w:rFonts w:ascii="Times New Roman" w:hAnsi="Times New Roman" w:cs="Times New Roman"/>
+        </w:rPr>
+        <w:t>operasi</w:t>
+      </w:r>
+      <w:proofErr w:type="spellEnd"/>
+      <w:r>
+        <w:rPr>
+          <w:rFonts w:ascii="Times New Roman" w:hAnsi="Times New Roman" w:cs="Times New Roman"/>
+        </w:rPr>
+        <w:t xml:space="preserve"> CRUD (Create, Read, Update, Delete) </w:t>
+      </w:r>
+      <w:proofErr w:type="spellStart"/>
+      <w:r>
+        <w:rPr>
+          <w:rFonts w:ascii="Times New Roman" w:hAnsi="Times New Roman" w:cs="Times New Roman"/>
+        </w:rPr>
+        <w:t>untuk</w:t>
+      </w:r>
+      <w:proofErr w:type="spellEnd"/>
+      <w:r>
+        <w:rPr>
+          <w:rFonts w:ascii="Times New Roman" w:hAnsi="Times New Roman" w:cs="Times New Roman"/>
+        </w:rPr>
+        <w:t xml:space="preserve"> </w:t>
+      </w:r>
+      <w:proofErr w:type="spellStart"/>
+      <w:r>
+        <w:rPr>
+          <w:rFonts w:ascii="Times New Roman" w:hAnsi="Times New Roman" w:cs="Times New Roman"/>
+        </w:rPr>
+        <w:t>menjaga</w:t>
+      </w:r>
+      <w:proofErr w:type="spellEnd"/>
+      <w:r>
+        <w:rPr>
+          <w:rFonts w:ascii="Times New Roman" w:hAnsi="Times New Roman" w:cs="Times New Roman"/>
+        </w:rPr>
+        <w:t xml:space="preserve"> </w:t>
+      </w:r>
+      <w:proofErr w:type="spellStart"/>
+      <w:r>
+        <w:rPr>
+          <w:rFonts w:ascii="Times New Roman" w:hAnsi="Times New Roman" w:cs="Times New Roman"/>
+        </w:rPr>
+        <w:t>validitas</w:t>
+      </w:r>
+      <w:proofErr w:type="spellEnd"/>
+      <w:r>
+        <w:rPr>
+          <w:rFonts w:ascii="Times New Roman" w:hAnsi="Times New Roman" w:cs="Times New Roman"/>
+        </w:rPr>
+        <w:t xml:space="preserve"> </w:t>
+      </w:r>
+      <w:proofErr w:type="spellStart"/>
+      <w:r>
+        <w:rPr>
+          <w:rFonts w:ascii="Times New Roman" w:hAnsi="Times New Roman" w:cs="Times New Roman"/>
+        </w:rPr>
+        <w:t>serta</w:t>
+      </w:r>
+      <w:proofErr w:type="spellEnd"/>
+      <w:r>
+        <w:rPr>
+          <w:rFonts w:ascii="Times New Roman" w:hAnsi="Times New Roman" w:cs="Times New Roman"/>
+        </w:rPr>
+        <w:t xml:space="preserve"> </w:t>
+      </w:r>
+      <w:proofErr w:type="spellStart"/>
+      <w:r>
+        <w:rPr>
+          <w:rFonts w:ascii="Times New Roman" w:hAnsi="Times New Roman" w:cs="Times New Roman"/>
+        </w:rPr>
+        <w:t>keamanan</w:t>
       </w:r>
       <w:proofErr w:type="spellEnd"/>
       <w:r>
@@ -26193,21 +26252,49 @@
         <w:rPr>
           <w:rFonts w:ascii="Times New Roman" w:hAnsi="Times New Roman" w:cs="Times New Roman"/>
         </w:rPr>
-        <w:t>pengguna</w:t>
-      </w:r>
-      <w:proofErr w:type="spellEnd"/>
-      <w:r>
-        <w:rPr>
-          <w:rFonts w:ascii="Times New Roman" w:hAnsi="Times New Roman" w:cs="Times New Roman"/>
-        </w:rPr>
-        <w:t xml:space="preserve"> yang </w:t>
-      </w:r>
-      <w:proofErr w:type="spellStart"/>
-      <w:r>
-        <w:rPr>
-          <w:rFonts w:ascii="Times New Roman" w:hAnsi="Times New Roman" w:cs="Times New Roman"/>
-        </w:rPr>
-        <w:t>efektif</w:t>
+        <w:t>akun</w:t>
+      </w:r>
+      <w:proofErr w:type="spellEnd"/>
+      <w:r>
+        <w:rPr>
+          <w:rFonts w:ascii="Times New Roman" w:hAnsi="Times New Roman" w:cs="Times New Roman"/>
+        </w:rPr>
+        <w:t xml:space="preserve">. </w:t>
+      </w:r>
+      <w:proofErr w:type="spellStart"/>
+      <w:r>
+        <w:rPr>
+          <w:rFonts w:ascii="Times New Roman" w:hAnsi="Times New Roman" w:cs="Times New Roman"/>
+        </w:rPr>
+        <w:t>Sistem</w:t>
+      </w:r>
+      <w:proofErr w:type="spellEnd"/>
+      <w:r>
+        <w:rPr>
+          <w:rFonts w:ascii="Times New Roman" w:hAnsi="Times New Roman" w:cs="Times New Roman"/>
+        </w:rPr>
+        <w:t xml:space="preserve"> </w:t>
+      </w:r>
+      <w:proofErr w:type="spellStart"/>
+      <w:r>
+        <w:rPr>
+          <w:rFonts w:ascii="Times New Roman" w:hAnsi="Times New Roman" w:cs="Times New Roman"/>
+        </w:rPr>
+        <w:t>ini</w:t>
+      </w:r>
+      <w:proofErr w:type="spellEnd"/>
+      <w:r>
+        <w:rPr>
+          <w:rFonts w:ascii="Times New Roman" w:hAnsi="Times New Roman" w:cs="Times New Roman"/>
+        </w:rPr>
+        <w:t xml:space="preserve"> juga </w:t>
+      </w:r>
+      <w:proofErr w:type="spellStart"/>
+      <w:r>
+        <w:rPr>
+          <w:rFonts w:ascii="Times New Roman" w:hAnsi="Times New Roman" w:cs="Times New Roman"/>
+        </w:rPr>
+        <w:t>dilengkapi</w:t>
       </w:r>
       <w:proofErr w:type="spellEnd"/>
       <w:r>
@@ -26228,448 +26315,42 @@
         <w:rPr>
           <w:rFonts w:ascii="Times New Roman" w:hAnsi="Times New Roman" w:cs="Times New Roman"/>
         </w:rPr>
-        <w:t xml:space="preserve"> tata </w:t>
-      </w:r>
-      <w:proofErr w:type="spellStart"/>
-      <w:r>
-        <w:rPr>
-          <w:rFonts w:ascii="Times New Roman" w:hAnsi="Times New Roman" w:cs="Times New Roman"/>
-        </w:rPr>
-        <w:t>letak</w:t>
-      </w:r>
-      <w:proofErr w:type="spellEnd"/>
-      <w:r>
-        <w:rPr>
-          <w:rFonts w:ascii="Times New Roman" w:hAnsi="Times New Roman" w:cs="Times New Roman"/>
-        </w:rPr>
-        <w:t xml:space="preserve"> yang </w:t>
-      </w:r>
-      <w:proofErr w:type="spellStart"/>
-      <w:r>
-        <w:rPr>
-          <w:rFonts w:ascii="Times New Roman" w:hAnsi="Times New Roman" w:cs="Times New Roman"/>
-        </w:rPr>
-        <w:t>terorganisir</w:t>
-      </w:r>
-      <w:proofErr w:type="spellEnd"/>
-      <w:r>
-        <w:rPr>
-          <w:rFonts w:ascii="Times New Roman" w:hAnsi="Times New Roman" w:cs="Times New Roman"/>
-        </w:rPr>
-        <w:t xml:space="preserve"> </w:t>
-      </w:r>
-      <w:proofErr w:type="spellStart"/>
-      <w:r>
-        <w:rPr>
-          <w:rFonts w:ascii="Times New Roman" w:hAnsi="Times New Roman" w:cs="Times New Roman"/>
-        </w:rPr>
-        <w:t>untuk</w:t>
-      </w:r>
-      <w:proofErr w:type="spellEnd"/>
-      <w:r>
-        <w:rPr>
-          <w:rFonts w:ascii="Times New Roman" w:hAnsi="Times New Roman" w:cs="Times New Roman"/>
-        </w:rPr>
-        <w:t xml:space="preserve"> administrator </w:t>
-      </w:r>
-      <w:proofErr w:type="spellStart"/>
-      <w:r>
-        <w:rPr>
-          <w:rFonts w:ascii="Times New Roman" w:hAnsi="Times New Roman" w:cs="Times New Roman"/>
-        </w:rPr>
-        <w:t>sistem</w:t>
-      </w:r>
-      <w:proofErr w:type="spellEnd"/>
-      <w:r>
-        <w:rPr>
-          <w:rFonts w:ascii="Times New Roman" w:hAnsi="Times New Roman" w:cs="Times New Roman"/>
-        </w:rPr>
-        <w:t xml:space="preserve">. </w:t>
-      </w:r>
-      <w:proofErr w:type="spellStart"/>
-      <w:r>
-        <w:rPr>
-          <w:rFonts w:ascii="Times New Roman" w:hAnsi="Times New Roman" w:cs="Times New Roman"/>
-        </w:rPr>
-        <w:t>Tampilan</w:t>
-      </w:r>
-      <w:proofErr w:type="spellEnd"/>
-      <w:r>
-        <w:rPr>
-          <w:rFonts w:ascii="Times New Roman" w:hAnsi="Times New Roman" w:cs="Times New Roman"/>
-        </w:rPr>
-        <w:t xml:space="preserve"> </w:t>
-      </w:r>
-      <w:proofErr w:type="spellStart"/>
-      <w:r>
-        <w:rPr>
-          <w:rFonts w:ascii="Times New Roman" w:hAnsi="Times New Roman" w:cs="Times New Roman"/>
-        </w:rPr>
-        <w:t>utama</w:t>
-      </w:r>
-      <w:proofErr w:type="spellEnd"/>
-      <w:r>
-        <w:rPr>
-          <w:rFonts w:ascii="Times New Roman" w:hAnsi="Times New Roman" w:cs="Times New Roman"/>
-        </w:rPr>
-        <w:t xml:space="preserve"> </w:t>
-      </w:r>
-      <w:proofErr w:type="spellStart"/>
-      <w:r>
-        <w:rPr>
-          <w:rFonts w:ascii="Times New Roman" w:hAnsi="Times New Roman" w:cs="Times New Roman"/>
-        </w:rPr>
-        <w:t>halaman</w:t>
-      </w:r>
-      <w:proofErr w:type="spellEnd"/>
-      <w:r>
-        <w:rPr>
-          <w:rFonts w:ascii="Times New Roman" w:hAnsi="Times New Roman" w:cs="Times New Roman"/>
-        </w:rPr>
-        <w:t xml:space="preserve"> </w:t>
-      </w:r>
-      <w:proofErr w:type="spellStart"/>
-      <w:r>
-        <w:rPr>
-          <w:rFonts w:ascii="Times New Roman" w:hAnsi="Times New Roman" w:cs="Times New Roman"/>
-        </w:rPr>
-        <w:t>terdiri</w:t>
-      </w:r>
-      <w:proofErr w:type="spellEnd"/>
-      <w:r>
-        <w:rPr>
-          <w:rFonts w:ascii="Times New Roman" w:hAnsi="Times New Roman" w:cs="Times New Roman"/>
-        </w:rPr>
-        <w:t xml:space="preserve"> </w:t>
-      </w:r>
-      <w:proofErr w:type="spellStart"/>
-      <w:r>
-        <w:rPr>
-          <w:rFonts w:ascii="Times New Roman" w:hAnsi="Times New Roman" w:cs="Times New Roman"/>
-        </w:rPr>
-        <w:t>dari</w:t>
-      </w:r>
-      <w:proofErr w:type="spellEnd"/>
-      <w:r>
-        <w:rPr>
-          <w:rFonts w:ascii="Times New Roman" w:hAnsi="Times New Roman" w:cs="Times New Roman"/>
-        </w:rPr>
-        <w:t xml:space="preserve"> panel </w:t>
-      </w:r>
-      <w:proofErr w:type="spellStart"/>
-      <w:r>
-        <w:rPr>
-          <w:rFonts w:ascii="Times New Roman" w:hAnsi="Times New Roman" w:cs="Times New Roman"/>
-        </w:rPr>
-        <w:t>kontrol</w:t>
-      </w:r>
-      <w:proofErr w:type="spellEnd"/>
-      <w:r>
-        <w:rPr>
-          <w:rFonts w:ascii="Times New Roman" w:hAnsi="Times New Roman" w:cs="Times New Roman"/>
-        </w:rPr>
-        <w:t xml:space="preserve"> yang </w:t>
-      </w:r>
-      <w:proofErr w:type="spellStart"/>
-      <w:r>
-        <w:rPr>
-          <w:rFonts w:ascii="Times New Roman" w:hAnsi="Times New Roman" w:cs="Times New Roman"/>
-        </w:rPr>
-        <w:t>menampilkan</w:t>
-      </w:r>
-      <w:proofErr w:type="spellEnd"/>
-      <w:r>
-        <w:rPr>
-          <w:rFonts w:ascii="Times New Roman" w:hAnsi="Times New Roman" w:cs="Times New Roman"/>
-        </w:rPr>
-        <w:t xml:space="preserve"> </w:t>
-      </w:r>
-      <w:proofErr w:type="spellStart"/>
-      <w:r>
-        <w:rPr>
-          <w:rFonts w:ascii="Times New Roman" w:hAnsi="Times New Roman" w:cs="Times New Roman"/>
-        </w:rPr>
-        <w:t>metrik</w:t>
-      </w:r>
-      <w:proofErr w:type="spellEnd"/>
-      <w:r>
-        <w:rPr>
-          <w:rFonts w:ascii="Times New Roman" w:hAnsi="Times New Roman" w:cs="Times New Roman"/>
-        </w:rPr>
-        <w:t xml:space="preserve"> </w:t>
-      </w:r>
-      <w:proofErr w:type="spellStart"/>
-      <w:r>
-        <w:rPr>
-          <w:rFonts w:ascii="Times New Roman" w:hAnsi="Times New Roman" w:cs="Times New Roman"/>
-        </w:rPr>
-        <w:t>statistik</w:t>
-      </w:r>
-      <w:proofErr w:type="spellEnd"/>
-      <w:r>
-        <w:rPr>
-          <w:rFonts w:ascii="Times New Roman" w:hAnsi="Times New Roman" w:cs="Times New Roman"/>
-        </w:rPr>
-        <w:t xml:space="preserve"> </w:t>
-      </w:r>
-      <w:proofErr w:type="spellStart"/>
-      <w:r>
-        <w:rPr>
-          <w:rFonts w:ascii="Times New Roman" w:hAnsi="Times New Roman" w:cs="Times New Roman"/>
-        </w:rPr>
-        <w:t>penting</w:t>
-      </w:r>
-      <w:proofErr w:type="spellEnd"/>
-      <w:r>
-        <w:rPr>
-          <w:rFonts w:ascii="Times New Roman" w:hAnsi="Times New Roman" w:cs="Times New Roman"/>
-        </w:rPr>
-        <w:t xml:space="preserve"> </w:t>
-      </w:r>
-      <w:proofErr w:type="spellStart"/>
-      <w:r>
-        <w:rPr>
-          <w:rFonts w:ascii="Times New Roman" w:hAnsi="Times New Roman" w:cs="Times New Roman"/>
-        </w:rPr>
-        <w:t>seperti</w:t>
-      </w:r>
-      <w:proofErr w:type="spellEnd"/>
-      <w:r>
-        <w:rPr>
-          <w:rFonts w:ascii="Times New Roman" w:hAnsi="Times New Roman" w:cs="Times New Roman"/>
-        </w:rPr>
-        <w:t xml:space="preserve"> </w:t>
-      </w:r>
-      <w:proofErr w:type="spellStart"/>
-      <w:r>
-        <w:rPr>
-          <w:rFonts w:ascii="Times New Roman" w:hAnsi="Times New Roman" w:cs="Times New Roman"/>
-        </w:rPr>
-        <w:t>jumlah</w:t>
-      </w:r>
-      <w:proofErr w:type="spellEnd"/>
-      <w:r>
-        <w:rPr>
-          <w:rFonts w:ascii="Times New Roman" w:hAnsi="Times New Roman" w:cs="Times New Roman"/>
-        </w:rPr>
-        <w:t xml:space="preserve"> </w:t>
-      </w:r>
-      <w:proofErr w:type="spellStart"/>
-      <w:r>
-        <w:rPr>
-          <w:rFonts w:ascii="Times New Roman" w:hAnsi="Times New Roman" w:cs="Times New Roman"/>
-        </w:rPr>
-        <w:t>pengguna</w:t>
-      </w:r>
-      <w:proofErr w:type="spellEnd"/>
-      <w:r>
-        <w:rPr>
-          <w:rFonts w:ascii="Times New Roman" w:hAnsi="Times New Roman" w:cs="Times New Roman"/>
-        </w:rPr>
-        <w:t xml:space="preserve"> total, </w:t>
-      </w:r>
-      <w:proofErr w:type="spellStart"/>
-      <w:r>
-        <w:rPr>
-          <w:rFonts w:ascii="Times New Roman" w:hAnsi="Times New Roman" w:cs="Times New Roman"/>
-        </w:rPr>
-        <w:t>pengguna</w:t>
-      </w:r>
-      <w:proofErr w:type="spellEnd"/>
-      <w:r>
-        <w:rPr>
-          <w:rFonts w:ascii="Times New Roman" w:hAnsi="Times New Roman" w:cs="Times New Roman"/>
-        </w:rPr>
-        <w:t xml:space="preserve"> </w:t>
-      </w:r>
-      <w:proofErr w:type="spellStart"/>
-      <w:r>
-        <w:rPr>
-          <w:rFonts w:ascii="Times New Roman" w:hAnsi="Times New Roman" w:cs="Times New Roman"/>
-        </w:rPr>
-        <w:t>aktif</w:t>
-      </w:r>
-      <w:proofErr w:type="spellEnd"/>
-      <w:r>
-        <w:rPr>
-          <w:rFonts w:ascii="Times New Roman" w:hAnsi="Times New Roman" w:cs="Times New Roman"/>
-        </w:rPr>
-        <w:t xml:space="preserve">, dan status </w:t>
-      </w:r>
-      <w:proofErr w:type="spellStart"/>
-      <w:r>
-        <w:rPr>
-          <w:rFonts w:ascii="Times New Roman" w:hAnsi="Times New Roman" w:cs="Times New Roman"/>
-        </w:rPr>
-        <w:t>koneksi</w:t>
-      </w:r>
-      <w:proofErr w:type="spellEnd"/>
-      <w:r>
-        <w:rPr>
-          <w:rFonts w:ascii="Times New Roman" w:hAnsi="Times New Roman" w:cs="Times New Roman"/>
-        </w:rPr>
-        <w:t xml:space="preserve"> </w:t>
-      </w:r>
-      <w:proofErr w:type="spellStart"/>
-      <w:r>
-        <w:rPr>
-          <w:rFonts w:ascii="Times New Roman" w:hAnsi="Times New Roman" w:cs="Times New Roman"/>
-        </w:rPr>
-        <w:t>sistem</w:t>
-      </w:r>
-      <w:proofErr w:type="spellEnd"/>
-      <w:r>
-        <w:rPr>
-          <w:rFonts w:ascii="Times New Roman" w:hAnsi="Times New Roman" w:cs="Times New Roman"/>
-        </w:rPr>
-        <w:t xml:space="preserve">, yang </w:t>
-      </w:r>
-      <w:proofErr w:type="spellStart"/>
-      <w:r>
-        <w:rPr>
-          <w:rFonts w:ascii="Times New Roman" w:hAnsi="Times New Roman" w:cs="Times New Roman"/>
-        </w:rPr>
-        <w:t>ditampilkan</w:t>
-      </w:r>
-      <w:proofErr w:type="spellEnd"/>
-      <w:r>
-        <w:rPr>
-          <w:rFonts w:ascii="Times New Roman" w:hAnsi="Times New Roman" w:cs="Times New Roman"/>
-        </w:rPr>
-        <w:t xml:space="preserve"> </w:t>
-      </w:r>
-      <w:proofErr w:type="spellStart"/>
-      <w:r>
-        <w:rPr>
-          <w:rFonts w:ascii="Times New Roman" w:hAnsi="Times New Roman" w:cs="Times New Roman"/>
-        </w:rPr>
-        <w:t>dalam</w:t>
-      </w:r>
-      <w:proofErr w:type="spellEnd"/>
-      <w:r>
-        <w:rPr>
-          <w:rFonts w:ascii="Times New Roman" w:hAnsi="Times New Roman" w:cs="Times New Roman"/>
-        </w:rPr>
-        <w:t xml:space="preserve"> </w:t>
-      </w:r>
-      <w:proofErr w:type="spellStart"/>
-      <w:r>
-        <w:rPr>
-          <w:rFonts w:ascii="Times New Roman" w:hAnsi="Times New Roman" w:cs="Times New Roman"/>
-        </w:rPr>
-        <w:t>bentuk</w:t>
-      </w:r>
-      <w:proofErr w:type="spellEnd"/>
-      <w:r>
-        <w:rPr>
-          <w:rFonts w:ascii="Times New Roman" w:hAnsi="Times New Roman" w:cs="Times New Roman"/>
-        </w:rPr>
-        <w:t xml:space="preserve"> </w:t>
-      </w:r>
-      <w:proofErr w:type="spellStart"/>
-      <w:r>
-        <w:rPr>
-          <w:rFonts w:ascii="Times New Roman" w:hAnsi="Times New Roman" w:cs="Times New Roman"/>
-        </w:rPr>
-        <w:t>kartu</w:t>
-      </w:r>
-      <w:proofErr w:type="spellEnd"/>
-      <w:r>
-        <w:rPr>
-          <w:rFonts w:ascii="Times New Roman" w:hAnsi="Times New Roman" w:cs="Times New Roman"/>
-        </w:rPr>
-        <w:t xml:space="preserve"> </w:t>
-      </w:r>
-      <w:proofErr w:type="spellStart"/>
-      <w:r>
-        <w:rPr>
-          <w:rFonts w:ascii="Times New Roman" w:hAnsi="Times New Roman" w:cs="Times New Roman"/>
-        </w:rPr>
-        <w:t>statistik</w:t>
-      </w:r>
-      <w:proofErr w:type="spellEnd"/>
-      <w:r>
-        <w:rPr>
-          <w:rFonts w:ascii="Times New Roman" w:hAnsi="Times New Roman" w:cs="Times New Roman"/>
-        </w:rPr>
-        <w:t xml:space="preserve"> </w:t>
-      </w:r>
-      <w:proofErr w:type="spellStart"/>
-      <w:r>
-        <w:rPr>
-          <w:rFonts w:ascii="Times New Roman" w:hAnsi="Times New Roman" w:cs="Times New Roman"/>
-        </w:rPr>
-        <w:t>kontemporer</w:t>
-      </w:r>
-      <w:proofErr w:type="spellEnd"/>
-      <w:r>
-        <w:rPr>
-          <w:rFonts w:ascii="Times New Roman" w:hAnsi="Times New Roman" w:cs="Times New Roman"/>
-        </w:rPr>
-        <w:t xml:space="preserve">. Bagian </w:t>
-      </w:r>
-      <w:proofErr w:type="spellStart"/>
-      <w:r>
-        <w:rPr>
-          <w:rFonts w:ascii="Times New Roman" w:hAnsi="Times New Roman" w:cs="Times New Roman"/>
-        </w:rPr>
-        <w:t>utama</w:t>
-      </w:r>
-      <w:proofErr w:type="spellEnd"/>
-      <w:r>
-        <w:rPr>
-          <w:rFonts w:ascii="Times New Roman" w:hAnsi="Times New Roman" w:cs="Times New Roman"/>
-        </w:rPr>
-        <w:t xml:space="preserve"> </w:t>
-      </w:r>
-      <w:proofErr w:type="spellStart"/>
-      <w:r>
-        <w:rPr>
-          <w:rFonts w:ascii="Times New Roman" w:hAnsi="Times New Roman" w:cs="Times New Roman"/>
-        </w:rPr>
-        <w:t>halaman</w:t>
-      </w:r>
-      <w:proofErr w:type="spellEnd"/>
-      <w:r>
-        <w:rPr>
-          <w:rFonts w:ascii="Times New Roman" w:hAnsi="Times New Roman" w:cs="Times New Roman"/>
-        </w:rPr>
-        <w:t xml:space="preserve"> </w:t>
-      </w:r>
-      <w:proofErr w:type="spellStart"/>
-      <w:r>
-        <w:rPr>
-          <w:rFonts w:ascii="Times New Roman" w:hAnsi="Times New Roman" w:cs="Times New Roman"/>
-        </w:rPr>
-        <w:t>terdiri</w:t>
-      </w:r>
-      <w:proofErr w:type="spellEnd"/>
-      <w:r>
-        <w:rPr>
-          <w:rFonts w:ascii="Times New Roman" w:hAnsi="Times New Roman" w:cs="Times New Roman"/>
-        </w:rPr>
-        <w:t xml:space="preserve"> </w:t>
-      </w:r>
-      <w:proofErr w:type="spellStart"/>
-      <w:r>
-        <w:rPr>
-          <w:rFonts w:ascii="Times New Roman" w:hAnsi="Times New Roman" w:cs="Times New Roman"/>
-        </w:rPr>
-        <w:t>dari</w:t>
-      </w:r>
-      <w:proofErr w:type="spellEnd"/>
-      <w:r>
-        <w:rPr>
-          <w:rFonts w:ascii="Times New Roman" w:hAnsi="Times New Roman" w:cs="Times New Roman"/>
-        </w:rPr>
-        <w:t xml:space="preserve"> </w:t>
-      </w:r>
-      <w:proofErr w:type="spellStart"/>
-      <w:r>
-        <w:rPr>
-          <w:rFonts w:ascii="Times New Roman" w:hAnsi="Times New Roman" w:cs="Times New Roman"/>
-        </w:rPr>
-        <w:t>tabel</w:t>
+        <w:t xml:space="preserve"> </w:t>
+      </w:r>
+      <w:proofErr w:type="spellStart"/>
+      <w:r>
+        <w:rPr>
+          <w:rFonts w:ascii="Times New Roman" w:hAnsi="Times New Roman" w:cs="Times New Roman"/>
+        </w:rPr>
+        <w:t>indikator</w:t>
+      </w:r>
+      <w:proofErr w:type="spellEnd"/>
+      <w:r>
+        <w:rPr>
+          <w:rFonts w:ascii="Times New Roman" w:hAnsi="Times New Roman" w:cs="Times New Roman"/>
+        </w:rPr>
+        <w:t xml:space="preserve"> status Live yang </w:t>
+      </w:r>
+      <w:proofErr w:type="spellStart"/>
+      <w:r>
+        <w:rPr>
+          <w:rFonts w:ascii="Times New Roman" w:hAnsi="Times New Roman" w:cs="Times New Roman"/>
+        </w:rPr>
+        <w:t>memastikan</w:t>
+      </w:r>
+      <w:proofErr w:type="spellEnd"/>
+      <w:r>
+        <w:rPr>
+          <w:rFonts w:ascii="Times New Roman" w:hAnsi="Times New Roman" w:cs="Times New Roman"/>
+        </w:rPr>
+        <w:t xml:space="preserve"> </w:t>
+      </w:r>
+      <w:proofErr w:type="spellStart"/>
+      <w:r>
+        <w:rPr>
+          <w:rFonts w:ascii="Times New Roman" w:hAnsi="Times New Roman" w:cs="Times New Roman"/>
+        </w:rPr>
+        <w:t>sinkronisasi</w:t>
       </w:r>
       <w:proofErr w:type="spellEnd"/>
       <w:r>
@@ -26683,42 +26364,28 @@
         <w:rPr>
           <w:rFonts w:ascii="Times New Roman" w:hAnsi="Times New Roman" w:cs="Times New Roman"/>
         </w:rPr>
-        <w:t>pengguna</w:t>
-      </w:r>
-      <w:proofErr w:type="spellEnd"/>
-      <w:r>
-        <w:rPr>
-          <w:rFonts w:ascii="Times New Roman" w:hAnsi="Times New Roman" w:cs="Times New Roman"/>
-        </w:rPr>
-        <w:t xml:space="preserve"> yang </w:t>
-      </w:r>
-      <w:proofErr w:type="spellStart"/>
-      <w:r>
-        <w:rPr>
-          <w:rFonts w:ascii="Times New Roman" w:hAnsi="Times New Roman" w:cs="Times New Roman"/>
-        </w:rPr>
-        <w:t>berfungsi</w:t>
-      </w:r>
-      <w:proofErr w:type="spellEnd"/>
-      <w:r>
-        <w:rPr>
-          <w:rFonts w:ascii="Times New Roman" w:hAnsi="Times New Roman" w:cs="Times New Roman"/>
-        </w:rPr>
-        <w:t xml:space="preserve">, </w:t>
-      </w:r>
-      <w:proofErr w:type="spellStart"/>
-      <w:r>
-        <w:rPr>
-          <w:rFonts w:ascii="Times New Roman" w:hAnsi="Times New Roman" w:cs="Times New Roman"/>
-        </w:rPr>
-        <w:t>dilengkapi</w:t>
-      </w:r>
-      <w:proofErr w:type="spellEnd"/>
-      <w:r>
-        <w:rPr>
-          <w:rFonts w:ascii="Times New Roman" w:hAnsi="Times New Roman" w:cs="Times New Roman"/>
-        </w:rPr>
-        <w:t xml:space="preserve"> </w:t>
+        <w:t>antara</w:t>
+      </w:r>
+      <w:proofErr w:type="spellEnd"/>
+      <w:r>
+        <w:rPr>
+          <w:rFonts w:ascii="Times New Roman" w:hAnsi="Times New Roman" w:cs="Times New Roman"/>
+        </w:rPr>
+        <w:t xml:space="preserve"> </w:t>
+      </w:r>
+      <w:proofErr w:type="spellStart"/>
+      <w:r>
+        <w:rPr>
+          <w:rFonts w:ascii="Times New Roman" w:hAnsi="Times New Roman" w:cs="Times New Roman"/>
+        </w:rPr>
+        <w:t>antarmuka</w:t>
+      </w:r>
+      <w:proofErr w:type="spellEnd"/>
+      <w:r>
+        <w:rPr>
+          <w:rFonts w:ascii="Times New Roman" w:hAnsi="Times New Roman" w:cs="Times New Roman"/>
+        </w:rPr>
+        <w:t xml:space="preserve"> admin </w:t>
       </w:r>
       <w:proofErr w:type="spellStart"/>
       <w:r>
@@ -26732,126 +26399,14 @@
         <w:rPr>
           <w:rFonts w:ascii="Times New Roman" w:hAnsi="Times New Roman" w:cs="Times New Roman"/>
         </w:rPr>
-        <w:t xml:space="preserve"> </w:t>
-      </w:r>
-      <w:proofErr w:type="spellStart"/>
-      <w:r>
-        <w:rPr>
-          <w:rFonts w:ascii="Times New Roman" w:hAnsi="Times New Roman" w:cs="Times New Roman"/>
-        </w:rPr>
-        <w:t>fitur</w:t>
-      </w:r>
-      <w:proofErr w:type="spellEnd"/>
-      <w:r>
-        <w:rPr>
-          <w:rFonts w:ascii="Times New Roman" w:hAnsi="Times New Roman" w:cs="Times New Roman"/>
-        </w:rPr>
-        <w:t xml:space="preserve"> </w:t>
-      </w:r>
-      <w:proofErr w:type="spellStart"/>
-      <w:r>
-        <w:rPr>
-          <w:rFonts w:ascii="Times New Roman" w:hAnsi="Times New Roman" w:cs="Times New Roman"/>
-        </w:rPr>
-        <w:t>tambahan</w:t>
-      </w:r>
-      <w:proofErr w:type="spellEnd"/>
-      <w:r>
-        <w:rPr>
-          <w:rFonts w:ascii="Times New Roman" w:hAnsi="Times New Roman" w:cs="Times New Roman"/>
-        </w:rPr>
-        <w:t xml:space="preserve"> </w:t>
-      </w:r>
-      <w:proofErr w:type="spellStart"/>
-      <w:r>
-        <w:rPr>
-          <w:rFonts w:ascii="Times New Roman" w:hAnsi="Times New Roman" w:cs="Times New Roman"/>
-        </w:rPr>
-        <w:t>seperti</w:t>
-      </w:r>
-      <w:proofErr w:type="spellEnd"/>
-      <w:r>
-        <w:rPr>
-          <w:rFonts w:ascii="Times New Roman" w:hAnsi="Times New Roman" w:cs="Times New Roman"/>
-        </w:rPr>
-        <w:t xml:space="preserve"> daftar </w:t>
-      </w:r>
-      <w:proofErr w:type="spellStart"/>
-      <w:r>
-        <w:rPr>
-          <w:rFonts w:ascii="Times New Roman" w:hAnsi="Times New Roman" w:cs="Times New Roman"/>
-        </w:rPr>
-        <w:t>pengguna</w:t>
-      </w:r>
-      <w:proofErr w:type="spellEnd"/>
-      <w:r>
-        <w:rPr>
-          <w:rFonts w:ascii="Times New Roman" w:hAnsi="Times New Roman" w:cs="Times New Roman"/>
-        </w:rPr>
-        <w:t xml:space="preserve"> </w:t>
-      </w:r>
-      <w:proofErr w:type="spellStart"/>
-      <w:r>
-        <w:rPr>
-          <w:rFonts w:ascii="Times New Roman" w:hAnsi="Times New Roman" w:cs="Times New Roman"/>
-        </w:rPr>
-        <w:t>aktif</w:t>
-      </w:r>
-      <w:proofErr w:type="spellEnd"/>
-      <w:r>
-        <w:rPr>
-          <w:rFonts w:ascii="Times New Roman" w:hAnsi="Times New Roman" w:cs="Times New Roman"/>
-        </w:rPr>
-        <w:t xml:space="preserve">. </w:t>
-      </w:r>
-      <w:proofErr w:type="spellStart"/>
-      <w:r>
-        <w:rPr>
-          <w:rFonts w:ascii="Times New Roman" w:hAnsi="Times New Roman" w:cs="Times New Roman"/>
-        </w:rPr>
-        <w:t>Dengan</w:t>
-      </w:r>
-      <w:proofErr w:type="spellEnd"/>
-      <w:r>
-        <w:rPr>
-          <w:rFonts w:ascii="Times New Roman" w:hAnsi="Times New Roman" w:cs="Times New Roman"/>
-        </w:rPr>
-        <w:t xml:space="preserve"> </w:t>
-      </w:r>
-      <w:proofErr w:type="spellStart"/>
-      <w:r>
-        <w:rPr>
-          <w:rFonts w:ascii="Times New Roman" w:hAnsi="Times New Roman" w:cs="Times New Roman"/>
-        </w:rPr>
-        <w:t>antarmuka</w:t>
-      </w:r>
-      <w:proofErr w:type="spellEnd"/>
-      <w:r>
-        <w:rPr>
-          <w:rFonts w:ascii="Times New Roman" w:hAnsi="Times New Roman" w:cs="Times New Roman"/>
-        </w:rPr>
-        <w:t xml:space="preserve"> yang </w:t>
-      </w:r>
-      <w:proofErr w:type="spellStart"/>
-      <w:r>
-        <w:rPr>
-          <w:rFonts w:ascii="Times New Roman" w:hAnsi="Times New Roman" w:cs="Times New Roman"/>
-        </w:rPr>
-        <w:t>bersih</w:t>
-      </w:r>
-      <w:proofErr w:type="spellEnd"/>
-      <w:r>
-        <w:rPr>
-          <w:rFonts w:ascii="Times New Roman" w:hAnsi="Times New Roman" w:cs="Times New Roman"/>
-        </w:rPr>
-        <w:t xml:space="preserve">, administrator </w:t>
-      </w:r>
-      <w:proofErr w:type="spellStart"/>
-      <w:r>
-        <w:rPr>
-          <w:rFonts w:ascii="Times New Roman" w:hAnsi="Times New Roman" w:cs="Times New Roman"/>
-        </w:rPr>
-        <w:t>dapat</w:t>
+        <w:t xml:space="preserve"> basis data </w:t>
+      </w:r>
+      <w:proofErr w:type="spellStart"/>
+      <w:r>
+        <w:rPr>
+          <w:rFonts w:ascii="Times New Roman" w:hAnsi="Times New Roman" w:cs="Times New Roman"/>
+        </w:rPr>
+        <w:t>berjalan</w:t>
       </w:r>
       <w:proofErr w:type="spellEnd"/>
       <w:r>
@@ -26879,217 +26434,7 @@
         <w:rPr>
           <w:rFonts w:ascii="Times New Roman" w:hAnsi="Times New Roman" w:cs="Times New Roman"/>
         </w:rPr>
-        <w:t>langsung</w:t>
-      </w:r>
-      <w:proofErr w:type="spellEnd"/>
-      <w:r>
-        <w:rPr>
-          <w:rFonts w:ascii="Times New Roman" w:hAnsi="Times New Roman" w:cs="Times New Roman"/>
-        </w:rPr>
-        <w:t xml:space="preserve"> </w:t>
-      </w:r>
-      <w:proofErr w:type="spellStart"/>
-      <w:r>
-        <w:rPr>
-          <w:rFonts w:ascii="Times New Roman" w:hAnsi="Times New Roman" w:cs="Times New Roman"/>
-        </w:rPr>
-        <w:t>memantau</w:t>
-      </w:r>
-      <w:proofErr w:type="spellEnd"/>
-      <w:r>
-        <w:rPr>
-          <w:rFonts w:ascii="Times New Roman" w:hAnsi="Times New Roman" w:cs="Times New Roman"/>
-        </w:rPr>
-        <w:t xml:space="preserve"> status </w:t>
-      </w:r>
-      <w:proofErr w:type="spellStart"/>
-      <w:r>
-        <w:rPr>
-          <w:rFonts w:ascii="Times New Roman" w:hAnsi="Times New Roman" w:cs="Times New Roman"/>
-        </w:rPr>
-        <w:t>akun</w:t>
-      </w:r>
-      <w:proofErr w:type="spellEnd"/>
-      <w:r>
-        <w:rPr>
-          <w:rFonts w:ascii="Times New Roman" w:hAnsi="Times New Roman" w:cs="Times New Roman"/>
-        </w:rPr>
-        <w:t xml:space="preserve"> dan </w:t>
-      </w:r>
-      <w:proofErr w:type="spellStart"/>
-      <w:r>
-        <w:rPr>
-          <w:rFonts w:ascii="Times New Roman" w:hAnsi="Times New Roman" w:cs="Times New Roman"/>
-        </w:rPr>
-        <w:t>melakukan</w:t>
-      </w:r>
-      <w:proofErr w:type="spellEnd"/>
-      <w:r>
-        <w:rPr>
-          <w:rFonts w:ascii="Times New Roman" w:hAnsi="Times New Roman" w:cs="Times New Roman"/>
-        </w:rPr>
-        <w:t xml:space="preserve"> </w:t>
-      </w:r>
-      <w:proofErr w:type="spellStart"/>
-      <w:r>
-        <w:rPr>
-          <w:rFonts w:ascii="Times New Roman" w:hAnsi="Times New Roman" w:cs="Times New Roman"/>
-        </w:rPr>
-        <w:t>tugas</w:t>
-      </w:r>
-      <w:proofErr w:type="spellEnd"/>
-      <w:r>
-        <w:rPr>
-          <w:rFonts w:ascii="Times New Roman" w:hAnsi="Times New Roman" w:cs="Times New Roman"/>
-        </w:rPr>
-        <w:t xml:space="preserve"> </w:t>
-      </w:r>
-      <w:proofErr w:type="spellStart"/>
-      <w:r>
-        <w:rPr>
-          <w:rFonts w:ascii="Times New Roman" w:hAnsi="Times New Roman" w:cs="Times New Roman"/>
-        </w:rPr>
-        <w:t>administratif</w:t>
-      </w:r>
-      <w:proofErr w:type="spellEnd"/>
-      <w:r>
-        <w:rPr>
-          <w:rFonts w:ascii="Times New Roman" w:hAnsi="Times New Roman" w:cs="Times New Roman"/>
-        </w:rPr>
-        <w:t xml:space="preserve">. Ini </w:t>
-      </w:r>
-      <w:proofErr w:type="spellStart"/>
-      <w:r>
-        <w:rPr>
-          <w:rFonts w:ascii="Times New Roman" w:hAnsi="Times New Roman" w:cs="Times New Roman"/>
-        </w:rPr>
-        <w:t>memastikan</w:t>
-      </w:r>
-      <w:proofErr w:type="spellEnd"/>
-      <w:r>
-        <w:rPr>
-          <w:rFonts w:ascii="Times New Roman" w:hAnsi="Times New Roman" w:cs="Times New Roman"/>
-        </w:rPr>
-        <w:t xml:space="preserve"> </w:t>
-      </w:r>
-      <w:proofErr w:type="spellStart"/>
-      <w:r>
-        <w:rPr>
-          <w:rFonts w:ascii="Times New Roman" w:hAnsi="Times New Roman" w:cs="Times New Roman"/>
-        </w:rPr>
-        <w:t>bahwa</w:t>
-      </w:r>
-      <w:proofErr w:type="spellEnd"/>
-      <w:r>
-        <w:rPr>
-          <w:rFonts w:ascii="Times New Roman" w:hAnsi="Times New Roman" w:cs="Times New Roman"/>
-        </w:rPr>
-        <w:t xml:space="preserve"> </w:t>
-      </w:r>
-      <w:proofErr w:type="spellStart"/>
-      <w:r>
-        <w:rPr>
-          <w:rFonts w:ascii="Times New Roman" w:hAnsi="Times New Roman" w:cs="Times New Roman"/>
-        </w:rPr>
-        <w:t>pengelolaan</w:t>
-      </w:r>
-      <w:proofErr w:type="spellEnd"/>
-      <w:r>
-        <w:rPr>
-          <w:rFonts w:ascii="Times New Roman" w:hAnsi="Times New Roman" w:cs="Times New Roman"/>
-        </w:rPr>
-        <w:t xml:space="preserve"> </w:t>
-      </w:r>
-      <w:proofErr w:type="spellStart"/>
-      <w:r>
-        <w:rPr>
-          <w:rFonts w:ascii="Times New Roman" w:hAnsi="Times New Roman" w:cs="Times New Roman"/>
-        </w:rPr>
-        <w:t>hak</w:t>
-      </w:r>
-      <w:proofErr w:type="spellEnd"/>
-      <w:r>
-        <w:rPr>
-          <w:rFonts w:ascii="Times New Roman" w:hAnsi="Times New Roman" w:cs="Times New Roman"/>
-        </w:rPr>
-        <w:t xml:space="preserve"> </w:t>
-      </w:r>
-      <w:proofErr w:type="spellStart"/>
-      <w:r>
-        <w:rPr>
-          <w:rFonts w:ascii="Times New Roman" w:hAnsi="Times New Roman" w:cs="Times New Roman"/>
-        </w:rPr>
-        <w:t>akses</w:t>
-      </w:r>
-      <w:proofErr w:type="spellEnd"/>
-      <w:r>
-        <w:rPr>
-          <w:rFonts w:ascii="Times New Roman" w:hAnsi="Times New Roman" w:cs="Times New Roman"/>
-        </w:rPr>
-        <w:t xml:space="preserve"> dan </w:t>
-      </w:r>
-      <w:proofErr w:type="spellStart"/>
-      <w:r>
-        <w:rPr>
-          <w:rFonts w:ascii="Times New Roman" w:hAnsi="Times New Roman" w:cs="Times New Roman"/>
-        </w:rPr>
-        <w:t>manajemen</w:t>
-      </w:r>
-      <w:proofErr w:type="spellEnd"/>
-      <w:r>
-        <w:rPr>
-          <w:rFonts w:ascii="Times New Roman" w:hAnsi="Times New Roman" w:cs="Times New Roman"/>
-        </w:rPr>
-        <w:t xml:space="preserve"> </w:t>
-      </w:r>
-      <w:proofErr w:type="spellStart"/>
-      <w:r>
-        <w:rPr>
-          <w:rFonts w:ascii="Times New Roman" w:hAnsi="Times New Roman" w:cs="Times New Roman"/>
-        </w:rPr>
-        <w:t>pengguna</w:t>
-      </w:r>
-      <w:proofErr w:type="spellEnd"/>
-      <w:r>
-        <w:rPr>
-          <w:rFonts w:ascii="Times New Roman" w:hAnsi="Times New Roman" w:cs="Times New Roman"/>
-        </w:rPr>
-        <w:t xml:space="preserve"> </w:t>
-      </w:r>
-      <w:proofErr w:type="spellStart"/>
-      <w:r>
-        <w:rPr>
-          <w:rFonts w:ascii="Times New Roman" w:hAnsi="Times New Roman" w:cs="Times New Roman"/>
-        </w:rPr>
-        <w:t>tetap</w:t>
-      </w:r>
-      <w:proofErr w:type="spellEnd"/>
-      <w:r>
-        <w:rPr>
-          <w:rFonts w:ascii="Times New Roman" w:hAnsi="Times New Roman" w:cs="Times New Roman"/>
-        </w:rPr>
-        <w:t xml:space="preserve"> </w:t>
-      </w:r>
-      <w:proofErr w:type="spellStart"/>
-      <w:r>
-        <w:rPr>
-          <w:rFonts w:ascii="Times New Roman" w:hAnsi="Times New Roman" w:cs="Times New Roman"/>
-        </w:rPr>
-        <w:t>tepat</w:t>
-      </w:r>
-      <w:proofErr w:type="spellEnd"/>
-      <w:r>
-        <w:rPr>
-          <w:rFonts w:ascii="Times New Roman" w:hAnsi="Times New Roman" w:cs="Times New Roman"/>
-        </w:rPr>
-        <w:t xml:space="preserve"> dan </w:t>
-      </w:r>
-      <w:proofErr w:type="spellStart"/>
-      <w:r>
-        <w:rPr>
-          <w:rFonts w:ascii="Times New Roman" w:hAnsi="Times New Roman" w:cs="Times New Roman"/>
-        </w:rPr>
-        <w:t>jelas</w:t>
+        <w:t>kontinu</w:t>
       </w:r>
       <w:proofErr w:type="spellEnd"/>
       <w:r>
@@ -27101,12 +26446,768 @@
     </w:p>
     <w:p>
       <w:pPr>
-        <w:ind w:left="1800"/>
+        <w:ind w:left="1797"/>
         <w:jc w:val="both"/>
         <w:rPr>
           <w:rFonts w:ascii="Times New Roman" w:hAnsi="Times New Roman" w:cs="Times New Roman"/>
         </w:rPr>
       </w:pPr>
+      <w:proofErr w:type="spellStart"/>
+      <w:r>
+        <w:rPr>
+          <w:rFonts w:ascii="Times New Roman" w:hAnsi="Times New Roman" w:cs="Times New Roman"/>
+        </w:rPr>
+        <w:t>Sementara</w:t>
+      </w:r>
+      <w:proofErr w:type="spellEnd"/>
+      <w:r>
+        <w:rPr>
+          <w:rFonts w:ascii="Times New Roman" w:hAnsi="Times New Roman" w:cs="Times New Roman"/>
+        </w:rPr>
+        <w:t xml:space="preserve"> </w:t>
+      </w:r>
+      <w:proofErr w:type="spellStart"/>
+      <w:r>
+        <w:rPr>
+          <w:rFonts w:ascii="Times New Roman" w:hAnsi="Times New Roman" w:cs="Times New Roman"/>
+        </w:rPr>
+        <w:t>itu</w:t>
+      </w:r>
+      <w:proofErr w:type="spellEnd"/>
+      <w:r>
+        <w:rPr>
+          <w:rFonts w:ascii="Times New Roman" w:hAnsi="Times New Roman" w:cs="Times New Roman"/>
+        </w:rPr>
+        <w:t xml:space="preserve">, </w:t>
+      </w:r>
+      <w:proofErr w:type="spellStart"/>
+      <w:r>
+        <w:rPr>
+          <w:rFonts w:ascii="Times New Roman" w:hAnsi="Times New Roman" w:cs="Times New Roman"/>
+        </w:rPr>
+        <w:t>modul</w:t>
+      </w:r>
+      <w:proofErr w:type="spellEnd"/>
+      <w:r>
+        <w:rPr>
+          <w:rFonts w:ascii="Times New Roman" w:hAnsi="Times New Roman" w:cs="Times New Roman"/>
+        </w:rPr>
+        <w:t xml:space="preserve"> Riwayat Chat dan WhatsApp Chat </w:t>
+      </w:r>
+      <w:proofErr w:type="spellStart"/>
+      <w:r>
+        <w:rPr>
+          <w:rFonts w:ascii="Times New Roman" w:hAnsi="Times New Roman" w:cs="Times New Roman"/>
+        </w:rPr>
+        <w:t>berfungsi</w:t>
+      </w:r>
+      <w:proofErr w:type="spellEnd"/>
+      <w:r>
+        <w:rPr>
+          <w:rFonts w:ascii="Times New Roman" w:hAnsi="Times New Roman" w:cs="Times New Roman"/>
+        </w:rPr>
+        <w:t xml:space="preserve"> </w:t>
+      </w:r>
+      <w:proofErr w:type="spellStart"/>
+      <w:r>
+        <w:rPr>
+          <w:rFonts w:ascii="Times New Roman" w:hAnsi="Times New Roman" w:cs="Times New Roman"/>
+        </w:rPr>
+        <w:t>sebagai</w:t>
+      </w:r>
+      <w:proofErr w:type="spellEnd"/>
+      <w:r>
+        <w:rPr>
+          <w:rFonts w:ascii="Times New Roman" w:hAnsi="Times New Roman" w:cs="Times New Roman"/>
+        </w:rPr>
+        <w:t xml:space="preserve"> </w:t>
+      </w:r>
+      <w:proofErr w:type="spellStart"/>
+      <w:r>
+        <w:rPr>
+          <w:rFonts w:ascii="Times New Roman" w:hAnsi="Times New Roman" w:cs="Times New Roman"/>
+        </w:rPr>
+        <w:t>instrumen</w:t>
+      </w:r>
+      <w:proofErr w:type="spellEnd"/>
+      <w:r>
+        <w:rPr>
+          <w:rFonts w:ascii="Times New Roman" w:hAnsi="Times New Roman" w:cs="Times New Roman"/>
+        </w:rPr>
+        <w:t xml:space="preserve"> </w:t>
+      </w:r>
+      <w:proofErr w:type="spellStart"/>
+      <w:r>
+        <w:rPr>
+          <w:rFonts w:ascii="Times New Roman" w:hAnsi="Times New Roman" w:cs="Times New Roman"/>
+        </w:rPr>
+        <w:t>transparansi</w:t>
+      </w:r>
+      <w:proofErr w:type="spellEnd"/>
+      <w:r>
+        <w:rPr>
+          <w:rFonts w:ascii="Times New Roman" w:hAnsi="Times New Roman" w:cs="Times New Roman"/>
+        </w:rPr>
+        <w:t xml:space="preserve"> </w:t>
+      </w:r>
+      <w:proofErr w:type="spellStart"/>
+      <w:r>
+        <w:rPr>
+          <w:rFonts w:ascii="Times New Roman" w:hAnsi="Times New Roman" w:cs="Times New Roman"/>
+        </w:rPr>
+        <w:t>untuk</w:t>
+      </w:r>
+      <w:proofErr w:type="spellEnd"/>
+      <w:r>
+        <w:rPr>
+          <w:rFonts w:ascii="Times New Roman" w:hAnsi="Times New Roman" w:cs="Times New Roman"/>
+        </w:rPr>
+        <w:t xml:space="preserve"> </w:t>
+      </w:r>
+      <w:proofErr w:type="spellStart"/>
+      <w:r>
+        <w:rPr>
+          <w:rFonts w:ascii="Times New Roman" w:hAnsi="Times New Roman" w:cs="Times New Roman"/>
+        </w:rPr>
+        <w:t>mendokumentasikan</w:t>
+      </w:r>
+      <w:proofErr w:type="spellEnd"/>
+      <w:r>
+        <w:rPr>
+          <w:rFonts w:ascii="Times New Roman" w:hAnsi="Times New Roman" w:cs="Times New Roman"/>
+        </w:rPr>
+        <w:t xml:space="preserve"> </w:t>
+      </w:r>
+      <w:proofErr w:type="spellStart"/>
+      <w:r>
+        <w:rPr>
+          <w:rFonts w:ascii="Times New Roman" w:hAnsi="Times New Roman" w:cs="Times New Roman"/>
+        </w:rPr>
+        <w:t>setiap</w:t>
+      </w:r>
+      <w:proofErr w:type="spellEnd"/>
+      <w:r>
+        <w:rPr>
+          <w:rFonts w:ascii="Times New Roman" w:hAnsi="Times New Roman" w:cs="Times New Roman"/>
+        </w:rPr>
+        <w:t xml:space="preserve"> </w:t>
+      </w:r>
+      <w:proofErr w:type="spellStart"/>
+      <w:r>
+        <w:rPr>
+          <w:rFonts w:ascii="Times New Roman" w:hAnsi="Times New Roman" w:cs="Times New Roman"/>
+        </w:rPr>
+        <w:t>interaksi</w:t>
+      </w:r>
+      <w:proofErr w:type="spellEnd"/>
+      <w:r>
+        <w:rPr>
+          <w:rFonts w:ascii="Times New Roman" w:hAnsi="Times New Roman" w:cs="Times New Roman"/>
+        </w:rPr>
+        <w:t xml:space="preserve"> </w:t>
+      </w:r>
+      <w:proofErr w:type="spellStart"/>
+      <w:r>
+        <w:rPr>
+          <w:rFonts w:ascii="Times New Roman" w:hAnsi="Times New Roman" w:cs="Times New Roman"/>
+        </w:rPr>
+        <w:t>antara</w:t>
+      </w:r>
+      <w:proofErr w:type="spellEnd"/>
+      <w:r>
+        <w:rPr>
+          <w:rFonts w:ascii="Times New Roman" w:hAnsi="Times New Roman" w:cs="Times New Roman"/>
+        </w:rPr>
+        <w:t xml:space="preserve"> </w:t>
+      </w:r>
+      <w:proofErr w:type="spellStart"/>
+      <w:r>
+        <w:rPr>
+          <w:rFonts w:ascii="Times New Roman" w:hAnsi="Times New Roman" w:cs="Times New Roman"/>
+        </w:rPr>
+        <w:t>pengguna</w:t>
+      </w:r>
+      <w:proofErr w:type="spellEnd"/>
+      <w:r>
+        <w:rPr>
+          <w:rFonts w:ascii="Times New Roman" w:hAnsi="Times New Roman" w:cs="Times New Roman"/>
+        </w:rPr>
+        <w:t xml:space="preserve"> </w:t>
+      </w:r>
+      <w:proofErr w:type="spellStart"/>
+      <w:r>
+        <w:rPr>
+          <w:rFonts w:ascii="Times New Roman" w:hAnsi="Times New Roman" w:cs="Times New Roman"/>
+        </w:rPr>
+        <w:t>dengan</w:t>
+      </w:r>
+      <w:proofErr w:type="spellEnd"/>
+      <w:r>
+        <w:rPr>
+          <w:rFonts w:ascii="Times New Roman" w:hAnsi="Times New Roman" w:cs="Times New Roman"/>
+        </w:rPr>
+        <w:t xml:space="preserve"> Gemini AI, </w:t>
+      </w:r>
+      <w:proofErr w:type="spellStart"/>
+      <w:r>
+        <w:rPr>
+          <w:rFonts w:ascii="Times New Roman" w:hAnsi="Times New Roman" w:cs="Times New Roman"/>
+        </w:rPr>
+        <w:t>baik</w:t>
+      </w:r>
+      <w:proofErr w:type="spellEnd"/>
+      <w:r>
+        <w:rPr>
+          <w:rFonts w:ascii="Times New Roman" w:hAnsi="Times New Roman" w:cs="Times New Roman"/>
+        </w:rPr>
+        <w:t xml:space="preserve"> </w:t>
+      </w:r>
+      <w:proofErr w:type="spellStart"/>
+      <w:r>
+        <w:rPr>
+          <w:rFonts w:ascii="Times New Roman" w:hAnsi="Times New Roman" w:cs="Times New Roman"/>
+        </w:rPr>
+        <w:t>melalui</w:t>
+      </w:r>
+      <w:proofErr w:type="spellEnd"/>
+      <w:r>
+        <w:rPr>
+          <w:rFonts w:ascii="Times New Roman" w:hAnsi="Times New Roman" w:cs="Times New Roman"/>
+        </w:rPr>
+        <w:t xml:space="preserve"> </w:t>
+      </w:r>
+      <w:proofErr w:type="spellStart"/>
+      <w:r>
+        <w:rPr>
+          <w:rFonts w:ascii="Times New Roman" w:hAnsi="Times New Roman" w:cs="Times New Roman"/>
+        </w:rPr>
+        <w:t>antarmuka</w:t>
+      </w:r>
+      <w:proofErr w:type="spellEnd"/>
+      <w:r>
+        <w:rPr>
+          <w:rFonts w:ascii="Times New Roman" w:hAnsi="Times New Roman" w:cs="Times New Roman"/>
+        </w:rPr>
+        <w:t xml:space="preserve"> web </w:t>
+      </w:r>
+      <w:proofErr w:type="spellStart"/>
+      <w:r>
+        <w:rPr>
+          <w:rFonts w:ascii="Times New Roman" w:hAnsi="Times New Roman" w:cs="Times New Roman"/>
+        </w:rPr>
+        <w:t>maupun</w:t>
+      </w:r>
+      <w:proofErr w:type="spellEnd"/>
+      <w:r>
+        <w:rPr>
+          <w:rFonts w:ascii="Times New Roman" w:hAnsi="Times New Roman" w:cs="Times New Roman"/>
+        </w:rPr>
+        <w:t xml:space="preserve"> platform </w:t>
+      </w:r>
+      <w:proofErr w:type="spellStart"/>
+      <w:r>
+        <w:rPr>
+          <w:rFonts w:ascii="Times New Roman" w:hAnsi="Times New Roman" w:cs="Times New Roman"/>
+        </w:rPr>
+        <w:t>pesan</w:t>
+      </w:r>
+      <w:proofErr w:type="spellEnd"/>
+      <w:r>
+        <w:rPr>
+          <w:rFonts w:ascii="Times New Roman" w:hAnsi="Times New Roman" w:cs="Times New Roman"/>
+        </w:rPr>
+        <w:t xml:space="preserve"> </w:t>
+      </w:r>
+      <w:proofErr w:type="spellStart"/>
+      <w:r>
+        <w:rPr>
+          <w:rFonts w:ascii="Times New Roman" w:hAnsi="Times New Roman" w:cs="Times New Roman"/>
+        </w:rPr>
+        <w:t>instan</w:t>
+      </w:r>
+      <w:proofErr w:type="spellEnd"/>
+      <w:r>
+        <w:rPr>
+          <w:rFonts w:ascii="Times New Roman" w:hAnsi="Times New Roman" w:cs="Times New Roman"/>
+        </w:rPr>
+        <w:t xml:space="preserve">. </w:t>
+      </w:r>
+      <w:proofErr w:type="spellStart"/>
+      <w:r>
+        <w:rPr>
+          <w:rFonts w:ascii="Times New Roman" w:hAnsi="Times New Roman" w:cs="Times New Roman"/>
+        </w:rPr>
+        <w:t>Melalui</w:t>
+      </w:r>
+      <w:proofErr w:type="spellEnd"/>
+      <w:r>
+        <w:rPr>
+          <w:rFonts w:ascii="Times New Roman" w:hAnsi="Times New Roman" w:cs="Times New Roman"/>
+        </w:rPr>
+        <w:t xml:space="preserve"> </w:t>
+      </w:r>
+      <w:proofErr w:type="spellStart"/>
+      <w:r>
+        <w:rPr>
+          <w:rFonts w:ascii="Times New Roman" w:hAnsi="Times New Roman" w:cs="Times New Roman"/>
+        </w:rPr>
+        <w:t>fitur</w:t>
+      </w:r>
+      <w:proofErr w:type="spellEnd"/>
+      <w:r>
+        <w:rPr>
+          <w:rFonts w:ascii="Times New Roman" w:hAnsi="Times New Roman" w:cs="Times New Roman"/>
+        </w:rPr>
+        <w:t xml:space="preserve"> </w:t>
+      </w:r>
+      <w:proofErr w:type="spellStart"/>
+      <w:r>
+        <w:rPr>
+          <w:rFonts w:ascii="Times New Roman" w:hAnsi="Times New Roman" w:cs="Times New Roman"/>
+        </w:rPr>
+        <w:t>peninjauan</w:t>
+      </w:r>
+      <w:proofErr w:type="spellEnd"/>
+      <w:r>
+        <w:rPr>
+          <w:rFonts w:ascii="Times New Roman" w:hAnsi="Times New Roman" w:cs="Times New Roman"/>
+        </w:rPr>
+        <w:t xml:space="preserve"> detail </w:t>
+      </w:r>
+      <w:proofErr w:type="spellStart"/>
+      <w:r>
+        <w:rPr>
+          <w:rFonts w:ascii="Times New Roman" w:hAnsi="Times New Roman" w:cs="Times New Roman"/>
+        </w:rPr>
+        <w:t>percakapan</w:t>
+      </w:r>
+      <w:proofErr w:type="spellEnd"/>
+      <w:r>
+        <w:rPr>
+          <w:rFonts w:ascii="Times New Roman" w:hAnsi="Times New Roman" w:cs="Times New Roman"/>
+        </w:rPr>
+        <w:t xml:space="preserve">, administrator </w:t>
+      </w:r>
+      <w:proofErr w:type="spellStart"/>
+      <w:r>
+        <w:rPr>
+          <w:rFonts w:ascii="Times New Roman" w:hAnsi="Times New Roman" w:cs="Times New Roman"/>
+        </w:rPr>
+        <w:t>dapat</w:t>
+      </w:r>
+      <w:proofErr w:type="spellEnd"/>
+      <w:r>
+        <w:rPr>
+          <w:rFonts w:ascii="Times New Roman" w:hAnsi="Times New Roman" w:cs="Times New Roman"/>
+        </w:rPr>
+        <w:t xml:space="preserve"> </w:t>
+      </w:r>
+      <w:proofErr w:type="spellStart"/>
+      <w:r>
+        <w:rPr>
+          <w:rFonts w:ascii="Times New Roman" w:hAnsi="Times New Roman" w:cs="Times New Roman"/>
+        </w:rPr>
+        <w:t>melakukan</w:t>
+      </w:r>
+      <w:proofErr w:type="spellEnd"/>
+      <w:r>
+        <w:rPr>
+          <w:rFonts w:ascii="Times New Roman" w:hAnsi="Times New Roman" w:cs="Times New Roman"/>
+        </w:rPr>
+        <w:t xml:space="preserve"> audit </w:t>
+      </w:r>
+      <w:proofErr w:type="spellStart"/>
+      <w:r>
+        <w:rPr>
+          <w:rFonts w:ascii="Times New Roman" w:hAnsi="Times New Roman" w:cs="Times New Roman"/>
+        </w:rPr>
+        <w:t>terhadap</w:t>
+      </w:r>
+      <w:proofErr w:type="spellEnd"/>
+      <w:r>
+        <w:rPr>
+          <w:rFonts w:ascii="Times New Roman" w:hAnsi="Times New Roman" w:cs="Times New Roman"/>
+        </w:rPr>
+        <w:t xml:space="preserve"> </w:t>
+      </w:r>
+      <w:proofErr w:type="spellStart"/>
+      <w:r>
+        <w:rPr>
+          <w:rFonts w:ascii="Times New Roman" w:hAnsi="Times New Roman" w:cs="Times New Roman"/>
+        </w:rPr>
+        <w:t>kualitas</w:t>
+      </w:r>
+      <w:proofErr w:type="spellEnd"/>
+      <w:r>
+        <w:rPr>
+          <w:rFonts w:ascii="Times New Roman" w:hAnsi="Times New Roman" w:cs="Times New Roman"/>
+        </w:rPr>
+        <w:t xml:space="preserve"> </w:t>
+      </w:r>
+      <w:proofErr w:type="spellStart"/>
+      <w:r>
+        <w:rPr>
+          <w:rFonts w:ascii="Times New Roman" w:hAnsi="Times New Roman" w:cs="Times New Roman"/>
+        </w:rPr>
+        <w:t>respon</w:t>
+      </w:r>
+      <w:proofErr w:type="spellEnd"/>
+      <w:r>
+        <w:rPr>
+          <w:rFonts w:ascii="Times New Roman" w:hAnsi="Times New Roman" w:cs="Times New Roman"/>
+        </w:rPr>
+        <w:t xml:space="preserve"> bot </w:t>
+      </w:r>
+      <w:proofErr w:type="spellStart"/>
+      <w:r>
+        <w:rPr>
+          <w:rFonts w:ascii="Times New Roman" w:hAnsi="Times New Roman" w:cs="Times New Roman"/>
+        </w:rPr>
+        <w:t>serta</w:t>
+      </w:r>
+      <w:proofErr w:type="spellEnd"/>
+      <w:r>
+        <w:rPr>
+          <w:rFonts w:ascii="Times New Roman" w:hAnsi="Times New Roman" w:cs="Times New Roman"/>
+        </w:rPr>
+        <w:t xml:space="preserve"> </w:t>
+      </w:r>
+      <w:proofErr w:type="spellStart"/>
+      <w:r>
+        <w:rPr>
+          <w:rFonts w:ascii="Times New Roman" w:hAnsi="Times New Roman" w:cs="Times New Roman"/>
+        </w:rPr>
+        <w:t>menganalisis</w:t>
+      </w:r>
+      <w:proofErr w:type="spellEnd"/>
+      <w:r>
+        <w:rPr>
+          <w:rFonts w:ascii="Times New Roman" w:hAnsi="Times New Roman" w:cs="Times New Roman"/>
+        </w:rPr>
+        <w:t xml:space="preserve"> </w:t>
+      </w:r>
+      <w:proofErr w:type="spellStart"/>
+      <w:r>
+        <w:rPr>
+          <w:rFonts w:ascii="Times New Roman" w:hAnsi="Times New Roman" w:cs="Times New Roman"/>
+        </w:rPr>
+        <w:t>tren</w:t>
+      </w:r>
+      <w:proofErr w:type="spellEnd"/>
+      <w:r>
+        <w:rPr>
+          <w:rFonts w:ascii="Times New Roman" w:hAnsi="Times New Roman" w:cs="Times New Roman"/>
+        </w:rPr>
+        <w:t xml:space="preserve"> </w:t>
+      </w:r>
+      <w:proofErr w:type="spellStart"/>
+      <w:r>
+        <w:rPr>
+          <w:rFonts w:ascii="Times New Roman" w:hAnsi="Times New Roman" w:cs="Times New Roman"/>
+        </w:rPr>
+        <w:t>kebutuhan</w:t>
+      </w:r>
+      <w:proofErr w:type="spellEnd"/>
+      <w:r>
+        <w:rPr>
+          <w:rFonts w:ascii="Times New Roman" w:hAnsi="Times New Roman" w:cs="Times New Roman"/>
+        </w:rPr>
+        <w:t xml:space="preserve"> </w:t>
+      </w:r>
+      <w:proofErr w:type="spellStart"/>
+      <w:r>
+        <w:rPr>
+          <w:rFonts w:ascii="Times New Roman" w:hAnsi="Times New Roman" w:cs="Times New Roman"/>
+        </w:rPr>
+        <w:t>pelanggan</w:t>
+      </w:r>
+      <w:proofErr w:type="spellEnd"/>
+      <w:r>
+        <w:rPr>
+          <w:rFonts w:ascii="Times New Roman" w:hAnsi="Times New Roman" w:cs="Times New Roman"/>
+        </w:rPr>
+        <w:t xml:space="preserve"> </w:t>
+      </w:r>
+      <w:proofErr w:type="spellStart"/>
+      <w:r>
+        <w:rPr>
+          <w:rFonts w:ascii="Times New Roman" w:hAnsi="Times New Roman" w:cs="Times New Roman"/>
+        </w:rPr>
+        <w:t>berdasarkan</w:t>
+      </w:r>
+      <w:proofErr w:type="spellEnd"/>
+      <w:r>
+        <w:rPr>
+          <w:rFonts w:ascii="Times New Roman" w:hAnsi="Times New Roman" w:cs="Times New Roman"/>
+        </w:rPr>
+        <w:t xml:space="preserve"> log </w:t>
+      </w:r>
+      <w:proofErr w:type="spellStart"/>
+      <w:r>
+        <w:rPr>
+          <w:rFonts w:ascii="Times New Roman" w:hAnsi="Times New Roman" w:cs="Times New Roman"/>
+        </w:rPr>
+        <w:t>percakapan</w:t>
+      </w:r>
+      <w:proofErr w:type="spellEnd"/>
+      <w:r>
+        <w:rPr>
+          <w:rFonts w:ascii="Times New Roman" w:hAnsi="Times New Roman" w:cs="Times New Roman"/>
+        </w:rPr>
+        <w:t xml:space="preserve"> yang </w:t>
+      </w:r>
+      <w:proofErr w:type="spellStart"/>
+      <w:r>
+        <w:rPr>
+          <w:rFonts w:ascii="Times New Roman" w:hAnsi="Times New Roman" w:cs="Times New Roman"/>
+        </w:rPr>
+        <w:t>tersimpan</w:t>
+      </w:r>
+      <w:proofErr w:type="spellEnd"/>
+      <w:r>
+        <w:rPr>
+          <w:rFonts w:ascii="Times New Roman" w:hAnsi="Times New Roman" w:cs="Times New Roman"/>
+        </w:rPr>
+        <w:t xml:space="preserve"> </w:t>
+      </w:r>
+      <w:proofErr w:type="spellStart"/>
+      <w:r>
+        <w:rPr>
+          <w:rFonts w:ascii="Times New Roman" w:hAnsi="Times New Roman" w:cs="Times New Roman"/>
+        </w:rPr>
+        <w:t>secara</w:t>
+      </w:r>
+      <w:proofErr w:type="spellEnd"/>
+      <w:r>
+        <w:rPr>
+          <w:rFonts w:ascii="Times New Roman" w:hAnsi="Times New Roman" w:cs="Times New Roman"/>
+        </w:rPr>
+        <w:t xml:space="preserve"> </w:t>
+      </w:r>
+      <w:proofErr w:type="spellStart"/>
+      <w:r>
+        <w:rPr>
+          <w:rFonts w:ascii="Times New Roman" w:hAnsi="Times New Roman" w:cs="Times New Roman"/>
+        </w:rPr>
+        <w:t>sistematis</w:t>
+      </w:r>
+      <w:proofErr w:type="spellEnd"/>
+      <w:r>
+        <w:rPr>
+          <w:rFonts w:ascii="Times New Roman" w:hAnsi="Times New Roman" w:cs="Times New Roman"/>
+        </w:rPr>
+        <w:t xml:space="preserve">. </w:t>
+      </w:r>
+      <w:proofErr w:type="spellStart"/>
+      <w:r>
+        <w:rPr>
+          <w:rFonts w:ascii="Times New Roman" w:hAnsi="Times New Roman" w:cs="Times New Roman"/>
+        </w:rPr>
+        <w:t>Keseluruhan</w:t>
+      </w:r>
+      <w:proofErr w:type="spellEnd"/>
+      <w:r>
+        <w:rPr>
+          <w:rFonts w:ascii="Times New Roman" w:hAnsi="Times New Roman" w:cs="Times New Roman"/>
+        </w:rPr>
+        <w:t xml:space="preserve"> </w:t>
+      </w:r>
+      <w:proofErr w:type="spellStart"/>
+      <w:r>
+        <w:rPr>
+          <w:rFonts w:ascii="Times New Roman" w:hAnsi="Times New Roman" w:cs="Times New Roman"/>
+        </w:rPr>
+        <w:t>antarmuka</w:t>
+      </w:r>
+      <w:proofErr w:type="spellEnd"/>
+      <w:r>
+        <w:rPr>
+          <w:rFonts w:ascii="Times New Roman" w:hAnsi="Times New Roman" w:cs="Times New Roman"/>
+        </w:rPr>
+        <w:t xml:space="preserve"> </w:t>
+      </w:r>
+      <w:proofErr w:type="spellStart"/>
+      <w:r>
+        <w:rPr>
+          <w:rFonts w:ascii="Times New Roman" w:hAnsi="Times New Roman" w:cs="Times New Roman"/>
+        </w:rPr>
+        <w:t>ini</w:t>
+      </w:r>
+      <w:proofErr w:type="spellEnd"/>
+      <w:r>
+        <w:rPr>
+          <w:rFonts w:ascii="Times New Roman" w:hAnsi="Times New Roman" w:cs="Times New Roman"/>
+        </w:rPr>
+        <w:t xml:space="preserve"> </w:t>
+      </w:r>
+      <w:proofErr w:type="spellStart"/>
+      <w:r>
+        <w:rPr>
+          <w:rFonts w:ascii="Times New Roman" w:hAnsi="Times New Roman" w:cs="Times New Roman"/>
+        </w:rPr>
+        <w:t>didukung</w:t>
+      </w:r>
+      <w:proofErr w:type="spellEnd"/>
+      <w:r>
+        <w:rPr>
+          <w:rFonts w:ascii="Times New Roman" w:hAnsi="Times New Roman" w:cs="Times New Roman"/>
+        </w:rPr>
+        <w:t xml:space="preserve"> oleh </w:t>
+      </w:r>
+      <w:proofErr w:type="spellStart"/>
+      <w:r>
+        <w:rPr>
+          <w:rFonts w:ascii="Times New Roman" w:hAnsi="Times New Roman" w:cs="Times New Roman"/>
+        </w:rPr>
+        <w:t>fitur</w:t>
+      </w:r>
+      <w:proofErr w:type="spellEnd"/>
+      <w:r>
+        <w:rPr>
+          <w:rFonts w:ascii="Times New Roman" w:hAnsi="Times New Roman" w:cs="Times New Roman"/>
+        </w:rPr>
+        <w:t xml:space="preserve"> </w:t>
+      </w:r>
+      <w:proofErr w:type="spellStart"/>
+      <w:r>
+        <w:rPr>
+          <w:rFonts w:ascii="Times New Roman" w:hAnsi="Times New Roman" w:cs="Times New Roman"/>
+        </w:rPr>
+        <w:t>pencarian</w:t>
+      </w:r>
+      <w:proofErr w:type="spellEnd"/>
+      <w:r>
+        <w:rPr>
+          <w:rFonts w:ascii="Times New Roman" w:hAnsi="Times New Roman" w:cs="Times New Roman"/>
+        </w:rPr>
+        <w:t xml:space="preserve"> dan </w:t>
+      </w:r>
+      <w:proofErr w:type="spellStart"/>
+      <w:r>
+        <w:rPr>
+          <w:rFonts w:ascii="Times New Roman" w:hAnsi="Times New Roman" w:cs="Times New Roman"/>
+        </w:rPr>
+        <w:t>paginasi</w:t>
+      </w:r>
+      <w:proofErr w:type="spellEnd"/>
+      <w:r>
+        <w:rPr>
+          <w:rFonts w:ascii="Times New Roman" w:hAnsi="Times New Roman" w:cs="Times New Roman"/>
+        </w:rPr>
+        <w:t xml:space="preserve"> yang </w:t>
+      </w:r>
+      <w:proofErr w:type="spellStart"/>
+      <w:r>
+        <w:rPr>
+          <w:rFonts w:ascii="Times New Roman" w:hAnsi="Times New Roman" w:cs="Times New Roman"/>
+        </w:rPr>
+        <w:t>responsif</w:t>
+      </w:r>
+      <w:proofErr w:type="spellEnd"/>
+      <w:r>
+        <w:rPr>
+          <w:rFonts w:ascii="Times New Roman" w:hAnsi="Times New Roman" w:cs="Times New Roman"/>
+        </w:rPr>
+        <w:t xml:space="preserve">, </w:t>
+      </w:r>
+      <w:proofErr w:type="spellStart"/>
+      <w:r>
+        <w:rPr>
+          <w:rFonts w:ascii="Times New Roman" w:hAnsi="Times New Roman" w:cs="Times New Roman"/>
+        </w:rPr>
+        <w:t>memastikan</w:t>
+      </w:r>
+      <w:proofErr w:type="spellEnd"/>
+      <w:r>
+        <w:rPr>
+          <w:rFonts w:ascii="Times New Roman" w:hAnsi="Times New Roman" w:cs="Times New Roman"/>
+        </w:rPr>
+        <w:t xml:space="preserve"> </w:t>
+      </w:r>
+      <w:proofErr w:type="spellStart"/>
+      <w:r>
+        <w:rPr>
+          <w:rFonts w:ascii="Times New Roman" w:hAnsi="Times New Roman" w:cs="Times New Roman"/>
+        </w:rPr>
+        <w:t>efisiensi</w:t>
+      </w:r>
+      <w:proofErr w:type="spellEnd"/>
+      <w:r>
+        <w:rPr>
+          <w:rFonts w:ascii="Times New Roman" w:hAnsi="Times New Roman" w:cs="Times New Roman"/>
+        </w:rPr>
+        <w:t xml:space="preserve"> dan </w:t>
+      </w:r>
+      <w:proofErr w:type="spellStart"/>
+      <w:r>
+        <w:rPr>
+          <w:rFonts w:ascii="Times New Roman" w:hAnsi="Times New Roman" w:cs="Times New Roman"/>
+        </w:rPr>
+        <w:t>akurasi</w:t>
+      </w:r>
+      <w:proofErr w:type="spellEnd"/>
+      <w:r>
+        <w:rPr>
+          <w:rFonts w:ascii="Times New Roman" w:hAnsi="Times New Roman" w:cs="Times New Roman"/>
+        </w:rPr>
+        <w:t xml:space="preserve"> </w:t>
+      </w:r>
+      <w:proofErr w:type="spellStart"/>
+      <w:r>
+        <w:rPr>
+          <w:rFonts w:ascii="Times New Roman" w:hAnsi="Times New Roman" w:cs="Times New Roman"/>
+        </w:rPr>
+        <w:t>dalam</w:t>
+      </w:r>
+      <w:proofErr w:type="spellEnd"/>
+      <w:r>
+        <w:rPr>
+          <w:rFonts w:ascii="Times New Roman" w:hAnsi="Times New Roman" w:cs="Times New Roman"/>
+        </w:rPr>
+        <w:t xml:space="preserve"> </w:t>
+      </w:r>
+      <w:proofErr w:type="spellStart"/>
+      <w:r>
+        <w:rPr>
+          <w:rFonts w:ascii="Times New Roman" w:hAnsi="Times New Roman" w:cs="Times New Roman"/>
+        </w:rPr>
+        <w:t>pengelolaan</w:t>
+      </w:r>
+      <w:proofErr w:type="spellEnd"/>
+      <w:r>
+        <w:rPr>
+          <w:rFonts w:ascii="Times New Roman" w:hAnsi="Times New Roman" w:cs="Times New Roman"/>
+        </w:rPr>
+        <w:t xml:space="preserve"> </w:t>
+      </w:r>
+      <w:proofErr w:type="spellStart"/>
+      <w:r>
+        <w:rPr>
+          <w:rFonts w:ascii="Times New Roman" w:hAnsi="Times New Roman" w:cs="Times New Roman"/>
+        </w:rPr>
+        <w:t>pusat</w:t>
+      </w:r>
+      <w:proofErr w:type="spellEnd"/>
+      <w:r>
+        <w:rPr>
+          <w:rFonts w:ascii="Times New Roman" w:hAnsi="Times New Roman" w:cs="Times New Roman"/>
+        </w:rPr>
+        <w:t xml:space="preserve"> data </w:t>
+      </w:r>
+      <w:proofErr w:type="spellStart"/>
+      <w:r>
+        <w:rPr>
+          <w:rFonts w:ascii="Times New Roman" w:hAnsi="Times New Roman" w:cs="Times New Roman"/>
+        </w:rPr>
+        <w:t>layanan</w:t>
+      </w:r>
+      <w:proofErr w:type="spellEnd"/>
+      <w:r>
+        <w:rPr>
+          <w:rFonts w:ascii="Times New Roman" w:hAnsi="Times New Roman" w:cs="Times New Roman"/>
+        </w:rPr>
+        <w:t xml:space="preserve"> pada PT Pos Indonesia.</w:t>
+      </w:r>
     </w:p>
     <w:p>
       <w:pPr>
@@ -27115,15 +27216,12 @@
         <w:jc w:val="both"/>
       </w:pPr>
       <w:r>
-        <w:rPr>
-          <w:noProof/>
-          <w14:ligatures w14:val="standardContextual"/>
-        </w:rPr>
+        <w:lastRenderedPageBreak/>
         <w:drawing>
-          <wp:inline distT="0" distB="0" distL="0" distR="0" wp14:anchorId="452BA610" wp14:editId="1CD2F6CD">
-            <wp:extent cx="5599383" cy="2771775"/>
-            <wp:effectExtent l="0" t="0" r="1905" b="0"/>
-            <wp:docPr id="513384876" name="Picture 1"/>
+          <wp:inline distT="0" distB="0" distL="0" distR="0" wp14:anchorId="13C48762" wp14:editId="3655218A">
+            <wp:extent cx="5731510" cy="2835275"/>
+            <wp:effectExtent l="0" t="0" r="2540" b="3175"/>
+            <wp:docPr id="1128193671" name="Picture 1"/>
             <wp:cNvGraphicFramePr>
               <a:graphicFrameLocks xmlns:a="http://schemas.openxmlformats.org/drawingml/2006/main" noChangeAspect="1"/>
             </wp:cNvGraphicFramePr>
@@ -27131,7 +27229,7 @@
               <a:graphicData uri="http://schemas.openxmlformats.org/drawingml/2006/picture">
                 <pic:pic xmlns:pic="http://schemas.openxmlformats.org/drawingml/2006/picture">
                   <pic:nvPicPr>
-                    <pic:cNvPr id="513384876" name=""/>
+                    <pic:cNvPr id="1128193671" name=""/>
                     <pic:cNvPicPr/>
                   </pic:nvPicPr>
                   <pic:blipFill>
@@ -27143,7 +27241,7 @@
                   <pic:spPr>
                     <a:xfrm>
                       <a:off x="0" y="0"/>
-                      <a:ext cx="5620603" cy="2782279"/>
+                      <a:ext cx="5731510" cy="2835275"/>
                     </a:xfrm>
                     <a:prstGeom prst="rect">
                       <a:avLst/>
@@ -27201,16 +27299,6 @@
     </w:p>
     <w:p>
       <w:pPr>
-        <w:ind w:left="1800" w:hanging="1800"/>
-        <w:jc w:val="both"/>
-        <w:rPr>
-          <w:rFonts w:ascii="Times New Roman" w:hAnsi="Times New Roman" w:cs="Times New Roman"/>
-        </w:rPr>
-      </w:pPr>
-    </w:p>
-    <w:p>
-      <w:pPr>
-        <w:ind w:left="1800" w:hanging="1800"/>
         <w:jc w:val="both"/>
         <w:rPr>
           <w:rFonts w:ascii="Times New Roman" w:hAnsi="Times New Roman" w:cs="Times New Roman"/>
@@ -28043,7 +28131,21 @@
         <w:rPr>
           <w:rFonts w:ascii="Times New Roman" w:hAnsi="Times New Roman" w:cs="Times New Roman"/>
         </w:rPr>
-        <w:t xml:space="preserve">. Integrasi API Gemini </w:t>
+        <w:t xml:space="preserve">. Integrasi </w:t>
+      </w:r>
+      <w:r>
+        <w:rPr>
+          <w:rFonts w:ascii="Times New Roman" w:hAnsi="Times New Roman" w:cs="Times New Roman"/>
+          <w:i/>
+          <w:iCs/>
+        </w:rPr>
+        <w:t>API Gemini</w:t>
+      </w:r>
+      <w:r>
+        <w:rPr>
+          <w:rFonts w:ascii="Times New Roman" w:hAnsi="Times New Roman" w:cs="Times New Roman"/>
+        </w:rPr>
+        <w:t xml:space="preserve"> </w:t>
       </w:r>
       <w:proofErr w:type="spellStart"/>
       <w:r>
@@ -28486,10 +28588,11 @@
           <w:noProof/>
           <w14:ligatures w14:val="standardContextual"/>
         </w:rPr>
+        <w:lastRenderedPageBreak/>
         <w:drawing>
-          <wp:inline distT="0" distB="0" distL="0" distR="0" wp14:anchorId="3C3982BF" wp14:editId="2FCC0677">
-            <wp:extent cx="5731510" cy="2822575"/>
-            <wp:effectExtent l="0" t="0" r="2540" b="0"/>
+          <wp:inline distT="0" distB="0" distL="0" distR="0" wp14:anchorId="3C3982BF" wp14:editId="18350A8F">
+            <wp:extent cx="5124450" cy="2523618"/>
+            <wp:effectExtent l="0" t="0" r="0" b="6985"/>
             <wp:docPr id="303935115" name="Picture 1"/>
             <wp:cNvGraphicFramePr>
               <a:graphicFrameLocks xmlns:a="http://schemas.openxmlformats.org/drawingml/2006/main" noChangeAspect="1"/>
@@ -28510,7 +28613,7 @@
                   <pic:spPr>
                     <a:xfrm>
                       <a:off x="0" y="0"/>
-                      <a:ext cx="5731510" cy="2822575"/>
+                      <a:ext cx="5124450" cy="2523618"/>
                     </a:xfrm>
                     <a:prstGeom prst="rect">
                       <a:avLst/>
@@ -28592,7 +28695,7 @@
           <w:szCs w:val="24"/>
         </w:rPr>
       </w:pPr>
-      <w:bookmarkStart w:id="60" w:name="_Toc219036885"/>
+      <w:bookmarkStart w:id="60" w:name="_Toc220012267"/>
       <w:proofErr w:type="spellStart"/>
       <w:r>
         <w:rPr>
@@ -29831,6 +29934,7 @@
         <w:rPr>
           <w:rFonts w:ascii="Times New Roman" w:hAnsi="Times New Roman" w:cs="Times New Roman"/>
         </w:rPr>
+        <w:lastRenderedPageBreak/>
         <w:t>Berdasarkan</w:t>
       </w:r>
       <w:proofErr w:type="spellEnd"/>
@@ -31573,14 +31677,7 @@
         <w:rPr>
           <w:rFonts w:ascii="Times New Roman" w:hAnsi="Times New Roman" w:cs="Times New Roman"/>
         </w:rPr>
-        <w:t xml:space="preserve"> </w:t>
-      </w:r>
-      <w:r>
-        <w:rPr>
-          <w:rFonts w:ascii="Times New Roman" w:hAnsi="Times New Roman" w:cs="Times New Roman"/>
-        </w:rPr>
-        <w:lastRenderedPageBreak/>
-        <w:t xml:space="preserve">database MongoDB yang </w:t>
+        <w:t xml:space="preserve"> database MongoDB yang </w:t>
       </w:r>
       <w:proofErr w:type="spellStart"/>
       <w:r>
@@ -32762,20 +32859,6 @@
     </w:p>
     <w:p>
       <w:pPr>
-        <w:spacing w:line="278" w:lineRule="auto"/>
-        <w:rPr>
-          <w:rFonts w:ascii="Times New Roman" w:hAnsi="Times New Roman" w:cs="Times New Roman"/>
-        </w:rPr>
-      </w:pPr>
-      <w:r>
-        <w:rPr>
-          <w:rFonts w:ascii="Times New Roman" w:hAnsi="Times New Roman" w:cs="Times New Roman"/>
-        </w:rPr>
-        <w:br w:type="page"/>
-      </w:r>
-    </w:p>
-    <w:p>
-      <w:pPr>
         <w:pStyle w:val="Heading1"/>
         <w:spacing w:before="0" w:line="360" w:lineRule="auto"/>
         <w:jc w:val="center"/>
@@ -32788,7 +32871,7 @@
           <w:szCs w:val="32"/>
         </w:rPr>
       </w:pPr>
-      <w:bookmarkStart w:id="62" w:name="_Toc219036886"/>
+      <w:bookmarkStart w:id="62" w:name="_Toc220012268"/>
       <w:r>
         <w:rPr>
           <w:rFonts w:ascii="Times New Roman" w:hAnsi="Times New Roman" w:cs="Times New Roman"/>
@@ -32817,7 +32900,7 @@
           <w:szCs w:val="32"/>
         </w:rPr>
       </w:pPr>
-      <w:bookmarkStart w:id="63" w:name="_Toc219036887"/>
+      <w:bookmarkStart w:id="63" w:name="_Toc220012269"/>
       <w:r>
         <w:rPr>
           <w:rFonts w:ascii="Times New Roman" w:hAnsi="Times New Roman" w:cs="Times New Roman"/>
@@ -32848,7 +32931,7 @@
           <w:szCs w:val="24"/>
         </w:rPr>
       </w:pPr>
-      <w:bookmarkStart w:id="64" w:name="_Toc219036888"/>
+      <w:bookmarkStart w:id="64" w:name="_Toc220012270"/>
       <w:r>
         <w:rPr>
           <w:rFonts w:ascii="Times New Roman" w:hAnsi="Times New Roman" w:cs="Times New Roman"/>
@@ -34901,7 +34984,7 @@
           <w:szCs w:val="24"/>
         </w:rPr>
       </w:pPr>
-      <w:bookmarkStart w:id="65" w:name="_Toc219036889"/>
+      <w:bookmarkStart w:id="65" w:name="_Toc220012271"/>
       <w:r>
         <w:rPr>
           <w:rFonts w:ascii="Times New Roman" w:hAnsi="Times New Roman" w:cs="Times New Roman"/>
@@ -36296,7 +36379,7 @@
           <w:szCs w:val="32"/>
         </w:rPr>
       </w:pPr>
-      <w:bookmarkStart w:id="66" w:name="_Toc219036890"/>
+      <w:bookmarkStart w:id="66" w:name="_Toc220012272"/>
       <w:r>
         <w:rPr>
           <w:rFonts w:ascii="Times New Roman" w:hAnsi="Times New Roman" w:cs="Times New Roman"/>
@@ -36508,7 +36591,7 @@
           <w:szCs w:val="32"/>
         </w:rPr>
       </w:pPr>
-      <w:bookmarkStart w:id="67" w:name="_Toc219036891"/>
+      <w:bookmarkStart w:id="67" w:name="_Toc220012273"/>
       <w:r>
         <w:rPr>
           <w:rFonts w:ascii="Times New Roman" w:hAnsi="Times New Roman" w:cs="Times New Roman"/>
@@ -38566,7 +38649,7 @@
           <w:szCs w:val="32"/>
         </w:rPr>
       </w:pPr>
-      <w:bookmarkStart w:id="68" w:name="_Toc219036892"/>
+      <w:bookmarkStart w:id="68" w:name="_Toc220012274"/>
       <w:r>
         <w:rPr>
           <w:rFonts w:ascii="Times New Roman" w:hAnsi="Times New Roman" w:cs="Times New Roman"/>

</xml_diff>